<commit_message>
Add box-connector ticks to conceptual model, re-render after prose edits
draw_concept_model() now drops a tick from the Cognition/Environmental
Orientation line to each box it labels, with a gap at NEP separating the
two segments. Also re-renders all three formats after the author's
intro/lit-review prose revisions.
</commit_message>
<xml_diff>
--- a/_output/cc-behave.docx
+++ b/_output/cc-behave.docx
@@ -247,7 +247,7 @@
         <w:t xml:space="preserve">(Henry and Dietz 2012, 238)</w:t>
       </w:r>
       <w:r>
-        <w:t xml:space="preserve">. We argue that environmental orientation contain a cognitive element as well as affective element. Deep core beliefs influence both the cognitive and affective aspects of environmental orientation. Finally, deep core beliefs and environmental orientations influence pro-environmental behaviors; however, deep core beliefs likely influence behaviors</w:t>
+        <w:t xml:space="preserve">. We argue that environmental orientations contain a cognitive element as well as an affective element. Deep core beliefs influence both the cognitive and affective aspects of environmental orientation. Finally, deep core beliefs and environmental orientations influence pro-environmental behaviors; however, deep core beliefs likely influence behaviors</w:t>
       </w:r>
       <w:r>
         <w:t xml:space="preserve"> </w:t>
@@ -263,7 +263,45 @@
         <w:t xml:space="preserve"> </w:t>
       </w:r>
       <w:r>
-        <w:t xml:space="preserve">[], with the affective element of environmental orientations having the most direct influence on behaviors [].</w:t>
+        <w:t xml:space="preserve">(Sparks et al. 2021)</w:t>
+      </w:r>
+      <w:r>
+        <w:t xml:space="preserve">, with the affective element of environmental orientations having the most direct influence on behaviors [].</w:t>
+      </w:r>
+    </w:p>
+    <w:bookmarkStart w:id="27" w:name="deep-core-beliefs-cultural-cognition"/>
+    <w:p>
+      <w:pPr>
+        <w:pStyle w:val="Heading2"/>
+      </w:pPr>
+      <w:r>
+        <w:t xml:space="preserve">Deep Core Beliefs: Cultural Cognition</w:t>
+      </w:r>
+    </w:p>
+    <w:p>
+      <w:pPr>
+        <w:pStyle w:val="FirstParagraph"/>
+      </w:pPr>
+      <w:r>
+        <w:t xml:space="preserve">For our measure of deep core beliefs we use cultural cognition. Cultural cognition is derived from the cultural theory of risk developed by Mary Douglas and Aaron Wildavsky</w:t>
+      </w:r>
+      <w:r>
+        <w:t xml:space="preserve"> </w:t>
+      </w:r>
+      <w:r>
+        <w:t xml:space="preserve">(Douglas and Wildavsky 1982; Thompson, Ellis, and Wildavsky 1990)</w:t>
+      </w:r>
+      <w:r>
+        <w:t xml:space="preserve">. Cultural theory (CT) has been identified as a leading way to conceptualize and measure deep core beliefs</w:t>
+      </w:r>
+      <w:r>
+        <w:t xml:space="preserve"> </w:t>
+      </w:r>
+      <w:r>
+        <w:t xml:space="preserve">(Ripberger et al. 2014)</w:t>
+      </w:r>
+      <w:r>
+        <w:t xml:space="preserve">. In brief, CT posits that social structures and relationships are represented by two dimensions, including a grid dimension and a group dimension. Four competing cultural worldviews arise based on their position on the grid and group dimensions. The grid dimension represents preferred social structures regarding the roles that one plays in society and the rules by which one must abide. The group dimension represents the importance of cohesive social units and the well-being of the broader community. The original formulation of CT produces four cultural worldviews based on the relative positions on the grid and group dimensions, including hierarchy (high grid, high group), egalitarianism (low grid, high group), individualism (low grid, and low group), and fatalism (high grid, low group).</w:t>
       </w:r>
     </w:p>
     <w:p>
@@ -271,6 +309,248 @@
         <w:pStyle w:val="BodyText"/>
       </w:pPr>
       <w:r>
+        <w:t xml:space="preserve">Cultural worldviews provide a foundational, or core belief that inform beliefs about specific policy issues (i.e., policy core beliefs), societal controversies, and risks, among other beliefs</w:t>
+      </w:r>
+      <w:r>
+        <w:t xml:space="preserve"> </w:t>
+      </w:r>
+      <w:r>
+        <w:t xml:space="preserve">(Jenkins-Smith et al. 2014; Nowlin 2019; Ripberger et al. 2014; Sotirov and Winkel 2016)</w:t>
+      </w:r>
+      <w:r>
+        <w:t xml:space="preserve">. Several studies have shown a connection between cultural worldviews and risk perceptions associated with a host of environmental issues</w:t>
+      </w:r>
+      <w:r>
+        <w:t xml:space="preserve"> </w:t>
+      </w:r>
+      <w:r>
+        <w:t xml:space="preserve">(see Xue et al. 2014)</w:t>
+      </w:r>
+      <w:r>
+        <w:t xml:space="preserve">, including fracking</w:t>
+      </w:r>
+      <w:r>
+        <w:t xml:space="preserve"> </w:t>
+      </w:r>
+      <w:r>
+        <w:t xml:space="preserve">(Boudet et al. 2014)</w:t>
+      </w:r>
+      <w:r>
+        <w:t xml:space="preserve">, nuclear waste</w:t>
+      </w:r>
+      <w:r>
+        <w:t xml:space="preserve"> </w:t>
+      </w:r>
+      <w:r>
+        <w:t xml:space="preserve">(Jenkins-Smith and Smith 1994)</w:t>
+      </w:r>
+      <w:r>
+        <w:t xml:space="preserve">, renewable energy</w:t>
+      </w:r>
+      <w:r>
+        <w:t xml:space="preserve"> </w:t>
+      </w:r>
+      <w:r>
+        <w:t xml:space="preserve">(Tumlison et al. 2018)</w:t>
+      </w:r>
+      <w:r>
+        <w:t xml:space="preserve">, geoengineering</w:t>
+      </w:r>
+      <w:r>
+        <w:t xml:space="preserve"> </w:t>
+      </w:r>
+      <w:r>
+        <w:t xml:space="preserve">(Kahan et al. 2015)</w:t>
+      </w:r>
+      <w:r>
+        <w:t xml:space="preserve">, high-voltage power lines</w:t>
+      </w:r>
+      <w:r>
+        <w:t xml:space="preserve"> </w:t>
+      </w:r>
+      <w:r>
+        <w:t xml:space="preserve">(Moyer and Song 2016, 2019)</w:t>
+      </w:r>
+      <w:r>
+        <w:t xml:space="preserve">, and climate change</w:t>
+      </w:r>
+      <w:r>
+        <w:t xml:space="preserve"> </w:t>
+      </w:r>
+      <w:r>
+        <w:t xml:space="preserve">(Jones 2011; Kahan et al. 2012; Nowlin 2022; Nowlin and Rabovsky 2020; Price, Walker, and Boschetti 2014)</w:t>
+      </w:r>
+      <w:r>
+        <w:t xml:space="preserve">, among others.</w:t>
+      </w:r>
+    </w:p>
+    <w:p>
+      <w:pPr>
+        <w:pStyle w:val="BodyText"/>
+      </w:pPr>
+      <w:r>
+        <w:t xml:space="preserve">Cultural cognition draws CT and its cultural worldviews, but makes two important distinctions. The first is its focus on social and psychological mechanisms that examine how cultural worldview’s shape interpret and process information, understand risks, and take positions on policy issues.</w:t>
+      </w:r>
+      <w:r>
+        <w:t xml:space="preserve"> </w:t>
+      </w:r>
+      <w:r>
+        <w:t xml:space="preserve">Kahan (2012)</w:t>
+      </w:r>
+      <w:r>
+        <w:t xml:space="preserve"> </w:t>
+      </w:r>
+      <w:r>
+        <w:t xml:space="preserve">identifies five mechanisms, including</w:t>
+      </w:r>
+      <w:r>
+        <w:t xml:space="preserve"> </w:t>
+      </w:r>
+      <w:r>
+        <w:rPr>
+          <w:i/>
+          <w:iCs/>
+        </w:rPr>
+        <w:t xml:space="preserve">cultural identity-protective cognition</w:t>
+      </w:r>
+      <w:r>
+        <w:t xml:space="preserve">, where individuals conform their beliefs to those in their</w:t>
+      </w:r>
+      <w:r>
+        <w:t xml:space="preserve"> </w:t>
+      </w:r>
+      <w:r>
+        <w:t xml:space="preserve">“group”</w:t>
+      </w:r>
+      <w:r>
+        <w:t xml:space="preserve"> </w:t>
+      </w:r>
+      <w:r>
+        <w:t xml:space="preserve">that share cultural values;</w:t>
+      </w:r>
+      <w:r>
+        <w:t xml:space="preserve"> </w:t>
+      </w:r>
+      <w:r>
+        <w:rPr>
+          <w:i/>
+          <w:iCs/>
+        </w:rPr>
+        <w:t xml:space="preserve">culturally biased assimilation and cultural polarization</w:t>
+      </w:r>
+      <w:r>
+        <w:t xml:space="preserve">, involves selective attention to worldview-confirming information and balanced information tends drives people of opposing worldviews further apart rather than together;</w:t>
+      </w:r>
+      <w:r>
+        <w:t xml:space="preserve"> </w:t>
+      </w:r>
+      <w:r>
+        <w:rPr>
+          <w:i/>
+          <w:iCs/>
+        </w:rPr>
+        <w:t xml:space="preserve">cultural availability</w:t>
+      </w:r>
+      <w:r>
+        <w:t xml:space="preserve"> </w:t>
+      </w:r>
+      <w:r>
+        <w:t xml:space="preserve">occurs as worldview-confirming events and experts are more readily noticed, credited, and recalled;</w:t>
+      </w:r>
+      <w:r>
+        <w:t xml:space="preserve"> </w:t>
+      </w:r>
+      <w:r>
+        <w:rPr>
+          <w:i/>
+          <w:iCs/>
+        </w:rPr>
+        <w:t xml:space="preserve">cultural credibility heuristic</w:t>
+      </w:r>
+      <w:r>
+        <w:t xml:space="preserve"> </w:t>
+      </w:r>
+      <w:r>
+        <w:t xml:space="preserve">is when people trust sources whose apparent values match their own; and</w:t>
+      </w:r>
+      <w:r>
+        <w:t xml:space="preserve"> </w:t>
+      </w:r>
+      <w:r>
+        <w:rPr>
+          <w:i/>
+          <w:iCs/>
+        </w:rPr>
+        <w:t xml:space="preserve">cultural-identity affirmation</w:t>
+      </w:r>
+      <w:r>
+        <w:t xml:space="preserve">, has been show when framing information alongside an identity-affirming rather than identity-threatening policy solution makes people more receptive to the underlying facts.</w:t>
+      </w:r>
+    </w:p>
+    <w:p>
+      <w:pPr>
+        <w:pStyle w:val="BodyText"/>
+      </w:pPr>
+      <w:r>
+        <w:t xml:space="preserve">The second distinction of cultural cognition from CT is how cultural worldviews are measured empirically. As noted, the CT worldviews are based on the placement on the grid and group dimensions, and worldviews are a result of placement on both. However, cultural cognition conceives grid and group as two orthogonal dimensions with worldviews identified as being high or low on each dimension rather than a combination of the dimensions. Those high on the grid dimension are called hierarchical as they prefer a society with well-defined roles and clear lines of authority, whereas those low on the grid dimension are termed egalitarian as they value a social order based on an equal sharing of power and resources. Communitarian is the worldview that is high on the group dimension, and it represents a preference for a collectivist society. Finally, individualism is low on the group dimension preferring increased individual autonomy and responsibility</w:t>
+      </w:r>
+      <w:r>
+        <w:t xml:space="preserve"> </w:t>
+      </w:r>
+      <w:r>
+        <w:t xml:space="preserve">(Kahan 2012; Kahan et al. 2012; Kahan and Braman 2006)</w:t>
+      </w:r>
+      <w:r>
+        <w:t xml:space="preserve">.</w:t>
+      </w:r>
+    </w:p>
+    <w:p>
+      <w:pPr>
+        <w:pStyle w:val="BodyText"/>
+      </w:pPr>
+      <w:r>
+        <w:t xml:space="preserve">In brief, cultural cognition posits that worldviews are based on views about ideal social structures and relationships, and perceptions of risk are based on the degree to which they undermine or threaten the preferred social order within each worldview.</w:t>
+      </w:r>
+    </w:p>
+    <w:p>
+      <w:pPr>
+        <w:pStyle w:val="BodyText"/>
+      </w:pPr>
+      <w:r>
+        <w:t xml:space="preserve">The</w:t>
+      </w:r>
+    </w:p>
+    <w:p>
+      <w:pPr>
+        <w:pStyle w:val="BodyText"/>
+      </w:pPr>
+      <w:r>
+        <w:t xml:space="preserve">In general, communitarianism, with its concern about collective well-being and egalitarianism, with its concern about the negative impacts of concentrated power tend to see threats to the natural world as a large risk. Hierarchs believe that natural resources can be well managed by experts and individualism supports the use of natural resources in private enterprise, and therefore hierarchy and individualism tend not to be concerned about environment harm. As noted, cultural worldviews have been found to be associated with attitudes about environmental issues, yet not associated with pro-environmental behaviors</w:t>
+      </w:r>
+      <w:r>
+        <w:t xml:space="preserve"> </w:t>
+      </w:r>
+      <w:r>
+        <w:t xml:space="preserve">(Sparks et al. 2021)</w:t>
+      </w:r>
+      <w:r>
+        <w:t xml:space="preserve">. However, cultural cognition is associated with pro-environmental orientation, specifically the New Ecological Paradigm (NEP)</w:t>
+      </w:r>
+      <w:r>
+        <w:t xml:space="preserve"> </w:t>
+      </w:r>
+      <w:r>
+        <w:t xml:space="preserve">(Nowlin 2019)</w:t>
+      </w:r>
+      <w:r>
+        <w:t xml:space="preserve">.</w:t>
+      </w:r>
+    </w:p>
+    <w:p>
+      <w:pPr>
+        <w:pStyle w:val="BodyText"/>
+      </w:pPr>
+      <w:r>
         <w:t xml:space="preserve">that higher-order beliefs, like deep core beliefs, shape how people think about issues and filter information</w:t>
       </w:r>
     </w:p>
@@ -311,13 +591,7 @@
         <w:pStyle w:val="BodyText"/>
       </w:pPr>
       <w:r>
-        <w:t xml:space="preserve">Policy scholars have developed a that can inform how beliefs influence attitudes [].</w:t>
-      </w:r>
-      <w:r>
-        <w:t xml:space="preserve"> </w:t>
-      </w:r>
-      <w:r>
-        <w:t xml:space="preserve">While not much work has connected belief systems to behavior</w:t>
+        <w:t xml:space="preserve">Policy scholars have developed a that can inform how beliefs influence attitudes []. While not much work has connected belief systems to behavior</w:t>
       </w:r>
     </w:p>
     <w:p>
@@ -458,166 +732,6 @@
       </w:r>
       <w:r>
         <w:t xml:space="preserve">]. Altogether, combining cultural cognition and environmental orientation should improve our understanding of the drivers of environmentally protective behaviors. Specifically, in this paper, we suggest that environmental orientation mediates the relationship between cultural cognition and environmental behavior. Essentially, environmental orientation helps connect cultural worldviews and risk perceptions to action to reduce that risk. Moreover, cultural cognition helps to bridge the attitude-behavior gap by providing a basis through environmental orientations derive and subsequently influence behavior.</w:t>
-      </w:r>
-    </w:p>
-    <w:bookmarkStart w:id="27" w:name="cultural-cognition"/>
-    <w:p>
-      <w:pPr>
-        <w:pStyle w:val="Heading2"/>
-      </w:pPr>
-      <w:r>
-        <w:t xml:space="preserve">Cultural Cognition</w:t>
-      </w:r>
-    </w:p>
-    <w:p>
-      <w:pPr>
-        <w:pStyle w:val="FirstParagraph"/>
-      </w:pPr>
-      <w:r>
-        <w:t xml:space="preserve">Cultural cognition is derived from the cultural theory of risk developed by Mary Douglas and Aaron Wildavsky</w:t>
-      </w:r>
-      <w:r>
-        <w:t xml:space="preserve"> </w:t>
-      </w:r>
-      <w:r>
-        <w:t xml:space="preserve">(Douglas and Wildavsky 1982; Thompson, Ellis, and Wildavsky 1990)</w:t>
-      </w:r>
-      <w:r>
-        <w:t xml:space="preserve">.</w:t>
-      </w:r>
-    </w:p>
-    <w:p>
-      <w:pPr>
-        <w:pStyle w:val="BodyText"/>
-      </w:pPr>
-      <w:r>
-        <w:t xml:space="preserve">In brief, cultural cognition posits that worldviews are based on views about ideal social structures and relationships, and perceptions of risk are based on the degree to which they undermine or threaten the preferred social order within each worldview.</w:t>
-      </w:r>
-    </w:p>
-    <w:p>
-      <w:pPr>
-        <w:pStyle w:val="BodyText"/>
-      </w:pPr>
-      <w:r>
-        <w:t xml:space="preserve">The social structures and relationships are represented by two dimensions including a grid dimension and a group dimension. Four competing cultural worldviews arise based on their position on the grid and group dimensions. The grid dimension represents preferred social structures regarding the roles that one plays in society and the rules by which one must abide. The worldview high on the grid dimension prefers a hierarchy in society with well-defined roles and clear lines of authority. Egalitarianism is the worldview low on the grid dimension and values a social order based on an equal sharing of power and resources. The group dimension represents the importance of cohesive social units and the well-being of the broader community. Communitarianism is the worldview that is high on the group dimension, and it represents a preference for a collectivist society. Finally, individualism is low on the group dimension preferring increased individual autonomy and responsibility</w:t>
-      </w:r>
-      <w:r>
-        <w:t xml:space="preserve"> </w:t>
-      </w:r>
-      <w:r>
-        <w:t xml:space="preserve">(Kahan 2012; Kahan and Braman 2006)</w:t>
-      </w:r>
-      <w:r>
-        <w:t xml:space="preserve">.</w:t>
-      </w:r>
-    </w:p>
-    <w:p>
-      <w:pPr>
-        <w:pStyle w:val="BodyText"/>
-      </w:pPr>
-      <w:r>
-        <w:t xml:space="preserve">Cultural worldviews provide a foundational, or core belief that inform beliefs about specific policy issues, societal controversies, and risks, among other beliefs</w:t>
-      </w:r>
-      <w:r>
-        <w:t xml:space="preserve"> </w:t>
-      </w:r>
-      <w:r>
-        <w:t xml:space="preserve">(Nowlin 2019; Ripberger et al. 2014)</w:t>
-      </w:r>
-      <w:r>
-        <w:t xml:space="preserve">. Several studies have shown a connection between cultural worldviews and risk perceptions associated with a host of environmental issues</w:t>
-      </w:r>
-      <w:r>
-        <w:t xml:space="preserve"> </w:t>
-      </w:r>
-      <w:r>
-        <w:t xml:space="preserve">(see Xue et al. 2014)</w:t>
-      </w:r>
-      <w:r>
-        <w:t xml:space="preserve"> </w:t>
-      </w:r>
-      <w:r>
-        <w:t xml:space="preserve">including fracking</w:t>
-      </w:r>
-      <w:r>
-        <w:t xml:space="preserve"> </w:t>
-      </w:r>
-      <w:r>
-        <w:t xml:space="preserve">(Boudet et al. 2014)</w:t>
-      </w:r>
-      <w:r>
-        <w:t xml:space="preserve">, nuclear waste</w:t>
-      </w:r>
-      <w:r>
-        <w:t xml:space="preserve"> </w:t>
-      </w:r>
-      <w:r>
-        <w:t xml:space="preserve">(Jenkins-Smith and Smith 1994)</w:t>
-      </w:r>
-      <w:r>
-        <w:t xml:space="preserve">, renewable energy</w:t>
-      </w:r>
-      <w:r>
-        <w:t xml:space="preserve"> </w:t>
-      </w:r>
-      <w:r>
-        <w:t xml:space="preserve">(Tumlison et al. 2018)</w:t>
-      </w:r>
-      <w:r>
-        <w:t xml:space="preserve">, geoengineering</w:t>
-      </w:r>
-      <w:r>
-        <w:t xml:space="preserve"> </w:t>
-      </w:r>
-      <w:r>
-        <w:t xml:space="preserve">(Kahan et al. 2015)</w:t>
-      </w:r>
-      <w:r>
-        <w:t xml:space="preserve">, high-voltage power lines</w:t>
-      </w:r>
-      <w:r>
-        <w:t xml:space="preserve"> </w:t>
-      </w:r>
-      <w:r>
-        <w:t xml:space="preserve">(Moyer and Song 2016, 2019)</w:t>
-      </w:r>
-      <w:r>
-        <w:t xml:space="preserve">, and climate change</w:t>
-      </w:r>
-      <w:r>
-        <w:t xml:space="preserve"> </w:t>
-      </w:r>
-      <w:r>
-        <w:t xml:space="preserve">(Jones 2011; Kahan et al. 2012; Nowlin and Rabovsky 2020; Price, Walker, and Boschetti 2014)</w:t>
-      </w:r>
-      <w:r>
-        <w:t xml:space="preserve">, among others.</w:t>
-      </w:r>
-    </w:p>
-    <w:p>
-      <w:pPr>
-        <w:pStyle w:val="BodyText"/>
-      </w:pPr>
-      <w:r>
-        <w:t xml:space="preserve">In general, communitarianism, with its concern about collective well-being and egalitarianism, with its concern about the negative impacts of concentrated power tend to see threats to the natural world as a large risk. Hierarchs believe that natural resources can be well managed by experts and individualism supports the use of natural resources in private enterprise, and therefore hierarchy and individualism tend not to be concerned about environment harm. As noted, cultural worldviews have been found to be associated with attitudes about environmental issues, yet not associated with pro-environmental behaviors</w:t>
-      </w:r>
-      <w:r>
-        <w:t xml:space="preserve"> </w:t>
-      </w:r>
-      <w:r>
-        <w:t xml:space="preserve">(Sparks et al. 2021)</w:t>
-      </w:r>
-      <w:r>
-        <w:t xml:space="preserve">. However, cultural cognition is associated with pro-environmental orientation, specifically the New Ecological Paradigm (NEP)</w:t>
-      </w:r>
-      <w:r>
-        <w:t xml:space="preserve"> </w:t>
-      </w:r>
-      <w:r>
-        <w:t xml:space="preserve">(Nowlin 2019)</w:t>
-      </w:r>
-      <w:r>
-        <w:t xml:space="preserve">.</w:t>
       </w:r>
     </w:p>
     <w:bookmarkEnd w:id="27"/>
@@ -1981,7 +2095,7 @@
         <w:t xml:space="preserve">, recycling had the highest mean among the self-reported behaviors at 0.79, which indicates that 79% of the respondents reported that they recycle. Recycling was followed closely by reducing household energy use at 0.78 and using less water at home at 0.75. The behaviors with the lowest means included buying/selling stocks at 0.12, contacting a business at 0.16, and attending a meeting at 0.17.</w:t>
       </w:r>
     </w:p>
-    <w:bookmarkStart w:id="38" w:name="cultural-cognition-1"/>
+    <w:bookmarkStart w:id="38" w:name="cultural-cognition"/>
     <w:p>
       <w:pPr>
         <w:pStyle w:val="Heading3"/>
@@ -5289,7 +5403,7 @@
       </w:r>
     </w:p>
     <w:bookmarkEnd w:id="52"/>
-    <w:bookmarkStart w:id="91" w:name="references"/>
+    <w:bookmarkStart w:id="94" w:name="references"/>
     <w:p>
       <w:pPr>
         <w:pStyle w:val="Heading1"/>
@@ -5298,7 +5412,7 @@
         <w:t xml:space="preserve">References</w:t>
       </w:r>
     </w:p>
-    <w:bookmarkStart w:id="90" w:name="refs"/>
+    <w:bookmarkStart w:id="93" w:name="refs"/>
     <w:bookmarkStart w:id="53" w:name="X02052c77ab6a183d9d4a564d1f5e6683aebb50c"/>
     <w:p>
       <w:pPr>
@@ -5983,7 +6097,123 @@
       </w:r>
     </w:p>
     <w:bookmarkEnd w:id="61"/>
-    <w:bookmarkStart w:id="62" w:name="ref-jenkins-smithIdeologyCultureRisk1994"/>
+    <w:bookmarkStart w:id="62" w:name="Xed27ba9cab4878368b76122bd8add1eb914ea06"/>
+    <w:p>
+      <w:pPr>
+        <w:pStyle w:val="Bibliography"/>
+      </w:pPr>
+      <w:r>
+        <w:t xml:space="preserve">Jenkins-Smith, Hank C., Carol L. Silva, Kuhika Gupta, and Joseph T. Ripberger. 2014.</w:t>
+      </w:r>
+      <w:r>
+        <w:t xml:space="preserve"> </w:t>
+      </w:r>
+      <w:r>
+        <w:t xml:space="preserve">“Belief</w:t>
+      </w:r>
+      <w:r>
+        <w:t xml:space="preserve"> </w:t>
+      </w:r>
+      <w:r>
+        <w:t xml:space="preserve">System Continuity</w:t>
+      </w:r>
+      <w:r>
+        <w:t xml:space="preserve"> </w:t>
+      </w:r>
+      <w:r>
+        <w:t xml:space="preserve">and</w:t>
+      </w:r>
+      <w:r>
+        <w:t xml:space="preserve"> </w:t>
+      </w:r>
+      <w:r>
+        <w:t xml:space="preserve">Change</w:t>
+      </w:r>
+      <w:r>
+        <w:t xml:space="preserve"> </w:t>
+      </w:r>
+      <w:r>
+        <w:t xml:space="preserve">in</w:t>
+      </w:r>
+      <w:r>
+        <w:t xml:space="preserve"> </w:t>
+      </w:r>
+      <w:r>
+        <w:t xml:space="preserve">Policy Advocacy Coalitions</w:t>
+      </w:r>
+      <w:r>
+        <w:t xml:space="preserve">:</w:t>
+      </w:r>
+      <w:r>
+        <w:t xml:space="preserve"> </w:t>
+      </w:r>
+      <w:r>
+        <w:t xml:space="preserve">Using Cultural Theory</w:t>
+      </w:r>
+      <w:r>
+        <w:t xml:space="preserve"> </w:t>
+      </w:r>
+      <w:r>
+        <w:t xml:space="preserve">to</w:t>
+      </w:r>
+      <w:r>
+        <w:t xml:space="preserve"> </w:t>
+      </w:r>
+      <w:r>
+        <w:t xml:space="preserve">Specify Belief Systems</w:t>
+      </w:r>
+      <w:r>
+        <w:t xml:space="preserve">,</w:t>
+      </w:r>
+      <w:r>
+        <w:t xml:space="preserve"> </w:t>
+      </w:r>
+      <w:r>
+        <w:t xml:space="preserve">Coalitions</w:t>
+      </w:r>
+      <w:r>
+        <w:t xml:space="preserve">, and</w:t>
+      </w:r>
+      <w:r>
+        <w:t xml:space="preserve"> </w:t>
+      </w:r>
+      <w:r>
+        <w:t xml:space="preserve">Sources</w:t>
+      </w:r>
+      <w:r>
+        <w:t xml:space="preserve"> </w:t>
+      </w:r>
+      <w:r>
+        <w:t xml:space="preserve">of</w:t>
+      </w:r>
+      <w:r>
+        <w:t xml:space="preserve"> </w:t>
+      </w:r>
+      <w:r>
+        <w:t xml:space="preserve">Change</w:t>
+      </w:r>
+      <w:r>
+        <w:t xml:space="preserve">.”</w:t>
+      </w:r>
+      <w:r>
+        <w:t xml:space="preserve"> </w:t>
+      </w:r>
+      <w:r>
+        <w:rPr>
+          <w:i/>
+          <w:iCs/>
+        </w:rPr>
+        <w:t xml:space="preserve">Policy Studies Journal</w:t>
+      </w:r>
+      <w:r>
+        <w:t xml:space="preserve"> </w:t>
+      </w:r>
+      <w:r>
+        <w:t xml:space="preserve">42(4): 484–508.</w:t>
+      </w:r>
+    </w:p>
+    <w:bookmarkEnd w:id="62"/>
+    <w:bookmarkStart w:id="63" w:name="ref-jenkins-smithIdeologyCultureRisk1994"/>
     <w:p>
       <w:pPr>
         <w:pStyle w:val="Bibliography"/>
@@ -6079,8 +6309,8 @@
         <w:t xml:space="preserve">, eds. Dennis J. Coyle and Richard J. Ellis. Boulder, CO: Westview Press, 17–32.</w:t>
       </w:r>
     </w:p>
-    <w:bookmarkEnd w:id="62"/>
-    <w:bookmarkStart w:id="63" w:name="ref-jonesLeadingWayCompromise2011"/>
+    <w:bookmarkEnd w:id="63"/>
+    <w:bookmarkStart w:id="64" w:name="ref-jonesLeadingWayCompromise2011"/>
     <w:p>
       <w:pPr>
         <w:pStyle w:val="Bibliography"/>
@@ -6153,8 +6383,8 @@
         <w:t xml:space="preserve">44(04): 720–25.</w:t>
       </w:r>
     </w:p>
-    <w:bookmarkEnd w:id="63"/>
-    <w:bookmarkStart w:id="64" w:name="ref-kahanCulturalCognitionConception2012"/>
+    <w:bookmarkEnd w:id="64"/>
+    <w:bookmarkStart w:id="65" w:name="ref-kahanCulturalCognitionConception2012"/>
     <w:p>
       <w:pPr>
         <w:pStyle w:val="Bibliography"/>
@@ -6359,8 +6589,8 @@
         <w:t xml:space="preserve">, eds. Sabine Roeser, Rafaela Hillerbrand, Per Sandin, and Martin Peterson. Springer, 725–59.</w:t>
       </w:r>
     </w:p>
-    <w:bookmarkEnd w:id="64"/>
-    <w:bookmarkStart w:id="65" w:name="ref-kahanCulturalCognitionPublic2006"/>
+    <w:bookmarkEnd w:id="65"/>
+    <w:bookmarkStart w:id="66" w:name="ref-kahanCulturalCognitionPublic2006"/>
     <w:p>
       <w:pPr>
         <w:pStyle w:val="Bibliography"/>
@@ -6412,8 +6642,8 @@
         <w:t xml:space="preserve">24(1): 147–70.</w:t>
       </w:r>
     </w:p>
-    <w:bookmarkEnd w:id="65"/>
-    <w:bookmarkStart w:id="66" w:name="X173998bc5d911bb28728c94f77cc6d079d9e73b"/>
+    <w:bookmarkEnd w:id="66"/>
+    <w:bookmarkStart w:id="67" w:name="X173998bc5d911bb28728c94f77cc6d079d9e73b"/>
     <w:p>
       <w:pPr>
         <w:pStyle w:val="Bibliography"/>
@@ -6486,8 +6716,8 @@
         <w:t xml:space="preserve">4(3): 465–505.</w:t>
       </w:r>
     </w:p>
-    <w:bookmarkEnd w:id="66"/>
-    <w:bookmarkStart w:id="67" w:name="ref-kahanGeoengineeringClimateChange2015"/>
+    <w:bookmarkEnd w:id="67"/>
+    <w:bookmarkStart w:id="68" w:name="ref-kahanGeoengineeringClimateChange2015"/>
     <w:p>
       <w:pPr>
         <w:pStyle w:val="Bibliography"/>
@@ -6551,8 +6781,8 @@
         <w:t xml:space="preserve">658(1): 192–222.</w:t>
       </w:r>
     </w:p>
-    <w:bookmarkEnd w:id="67"/>
-    <w:bookmarkStart w:id="68" w:name="ref-kahanPolarizingImpactScience2012"/>
+    <w:bookmarkEnd w:id="68"/>
+    <w:bookmarkStart w:id="69" w:name="ref-kahanPolarizingImpactScience2012"/>
     <w:p>
       <w:pPr>
         <w:pStyle w:val="Bibliography"/>
@@ -6628,8 +6858,8 @@
         <w:t xml:space="preserve">2(10): 732–35.</w:t>
       </w:r>
     </w:p>
-    <w:bookmarkEnd w:id="68"/>
-    <w:bookmarkStart w:id="69" w:name="ref-kaiserOffsettingBehavioralCosts2021"/>
+    <w:bookmarkEnd w:id="69"/>
+    <w:bookmarkStart w:id="70" w:name="ref-kaiserOffsettingBehavioralCosts2021"/>
     <w:p>
       <w:pPr>
         <w:pStyle w:val="Bibliography"/>
@@ -6702,8 +6932,8 @@
         <w:t xml:space="preserve">183: 111158.</w:t>
       </w:r>
     </w:p>
-    <w:bookmarkEnd w:id="69"/>
-    <w:bookmarkStart w:id="70" w:name="ref-kollmussMindGapWhy2002"/>
+    <w:bookmarkEnd w:id="70"/>
+    <w:bookmarkStart w:id="71" w:name="ref-kollmussMindGapWhy2002"/>
     <w:p>
       <w:pPr>
         <w:pStyle w:val="Bibliography"/>
@@ -6788,8 +7018,8 @@
         <w:t xml:space="preserve">8(3): 239–60.</w:t>
       </w:r>
     </w:p>
-    <w:bookmarkEnd w:id="70"/>
-    <w:bookmarkStart w:id="71" w:name="ref-kovacsActingWeFeel2024"/>
+    <w:bookmarkEnd w:id="71"/>
+    <w:bookmarkStart w:id="72" w:name="ref-kovacsActingWeFeel2024"/>
     <w:p>
       <w:pPr>
         <w:pStyle w:val="Bibliography"/>
@@ -6850,8 +7080,8 @@
         <w:t xml:space="preserve">96: 102327.</w:t>
       </w:r>
     </w:p>
-    <w:bookmarkEnd w:id="71"/>
-    <w:bookmarkStart w:id="72" w:name="ref-louMetaanalysisTemporalShifts2022"/>
+    <w:bookmarkEnd w:id="72"/>
+    <w:bookmarkStart w:id="73" w:name="ref-louMetaanalysisTemporalShifts2022"/>
     <w:p>
       <w:pPr>
         <w:pStyle w:val="Bibliography"/>
@@ -6939,8 +7169,8 @@
         <w:t xml:space="preserve">38: 100335.</w:t>
       </w:r>
     </w:p>
-    <w:bookmarkEnd w:id="72"/>
-    <w:bookmarkStart w:id="73" w:name="ref-mayerConnectednessNatureScale2004"/>
+    <w:bookmarkEnd w:id="73"/>
+    <w:bookmarkStart w:id="74" w:name="ref-mayerConnectednessNatureScale2004"/>
     <w:p>
       <w:pPr>
         <w:pStyle w:val="Bibliography"/>
@@ -7046,8 +7276,8 @@
         <w:t xml:space="preserve">24(4): 503–15.</w:t>
       </w:r>
     </w:p>
-    <w:bookmarkEnd w:id="73"/>
-    <w:bookmarkStart w:id="74" w:name="ref-moyerUnderstandingLocalPolicy2016"/>
+    <w:bookmarkEnd w:id="74"/>
+    <w:bookmarkStart w:id="75" w:name="ref-moyerUnderstandingLocalPolicy2016"/>
     <w:p>
       <w:pPr>
         <w:pStyle w:val="Bibliography"/>
@@ -7156,8 +7386,8 @@
         <w:t xml:space="preserve">36(10): 1983–99.</w:t>
       </w:r>
     </w:p>
-    <w:bookmarkEnd w:id="74"/>
-    <w:bookmarkStart w:id="75" w:name="Xc43ec768c008176b9f89abb4f6bf691741c435f"/>
+    <w:bookmarkEnd w:id="75"/>
+    <w:bookmarkStart w:id="76" w:name="Xc43ec768c008176b9f89abb4f6bf691741c435f"/>
     <w:p>
       <w:pPr>
         <w:pStyle w:val="Bibliography"/>
@@ -7251,8 +7481,8 @@
         <w:t xml:space="preserve">22(4): 416–31.</w:t>
       </w:r>
     </w:p>
-    <w:bookmarkEnd w:id="75"/>
-    <w:bookmarkStart w:id="76" w:name="X3b158972cbdaa45d56667a7f2c1f74a2ffefad4"/>
+    <w:bookmarkEnd w:id="76"/>
+    <w:bookmarkStart w:id="77" w:name="X3b158972cbdaa45d56667a7f2c1f74a2ffefad4"/>
     <w:p>
       <w:pPr>
         <w:pStyle w:val="Bibliography"/>
@@ -7330,8 +7560,8 @@
         <w:t xml:space="preserve">, ed. Christopher M. Weible. New York, NY: Routledge, 130–60.</w:t>
       </w:r>
     </w:p>
-    <w:bookmarkEnd w:id="76"/>
-    <w:bookmarkStart w:id="77" w:name="Xb4c99a0be57d39ff98fa8a07a8fe8d8503fbbac"/>
+    <w:bookmarkEnd w:id="77"/>
+    <w:bookmarkStart w:id="78" w:name="Xb4c99a0be57d39ff98fa8a07a8fe8d8503fbbac"/>
     <w:p>
       <w:pPr>
         <w:pStyle w:val="Bibliography"/>
@@ -7423,8 +7653,118 @@
         <w:t xml:space="preserve">. New York, NY: Routledge.</w:t>
       </w:r>
     </w:p>
-    <w:bookmarkEnd w:id="77"/>
-    <w:bookmarkStart w:id="78" w:name="ref-nowlinCulturalTheoryPartisanship2020"/>
+    <w:bookmarkEnd w:id="78"/>
+    <w:bookmarkStart w:id="79" w:name="ref-nowlinWhoShouldMore2022"/>
+    <w:p>
+      <w:pPr>
+        <w:pStyle w:val="Bibliography"/>
+      </w:pPr>
+      <w:r>
+        <w:t xml:space="preserve">———. 2022.</w:t>
+      </w:r>
+      <w:r>
+        <w:t xml:space="preserve"> </w:t>
+      </w:r>
+      <w:r>
+        <w:t xml:space="preserve">“Who</w:t>
+      </w:r>
+      <w:r>
+        <w:t xml:space="preserve"> </w:t>
+      </w:r>
+      <w:r>
+        <w:t xml:space="preserve">Should</w:t>
+      </w:r>
+      <w:r>
+        <w:t xml:space="preserve"> </w:t>
+      </w:r>
+      <w:r>
+        <w:t xml:space="preserve">‘</w:t>
+      </w:r>
+      <w:r>
+        <w:t xml:space="preserve">Do More</w:t>
+      </w:r>
+      <w:r>
+        <w:t xml:space="preserve">’</w:t>
+      </w:r>
+      <w:r>
+        <w:t xml:space="preserve"> </w:t>
+      </w:r>
+      <w:r>
+        <w:t xml:space="preserve">About Climate Change</w:t>
+      </w:r>
+      <w:r>
+        <w:t xml:space="preserve">?</w:t>
+      </w:r>
+      <w:r>
+        <w:t xml:space="preserve"> </w:t>
+      </w:r>
+      <w:r>
+        <w:t xml:space="preserve">Cultural Theory</w:t>
+      </w:r>
+      <w:r>
+        <w:t xml:space="preserve">,</w:t>
+      </w:r>
+      <w:r>
+        <w:t xml:space="preserve"> </w:t>
+      </w:r>
+      <w:r>
+        <w:t xml:space="preserve">Polycentricity</w:t>
+      </w:r>
+      <w:r>
+        <w:t xml:space="preserve">, and</w:t>
+      </w:r>
+      <w:r>
+        <w:t xml:space="preserve"> </w:t>
+      </w:r>
+      <w:r>
+        <w:t xml:space="preserve">Public Support</w:t>
+      </w:r>
+      <w:r>
+        <w:t xml:space="preserve"> </w:t>
+      </w:r>
+      <w:r>
+        <w:t xml:space="preserve">for</w:t>
+      </w:r>
+      <w:r>
+        <w:t xml:space="preserve"> </w:t>
+      </w:r>
+      <w:r>
+        <w:t xml:space="preserve">Climate Change Actions Across Actors</w:t>
+      </w:r>
+      <w:r>
+        <w:t xml:space="preserve"> </w:t>
+      </w:r>
+      <w:r>
+        <w:t xml:space="preserve">and</w:t>
+      </w:r>
+      <w:r>
+        <w:t xml:space="preserve"> </w:t>
+      </w:r>
+      <w:r>
+        <w:t xml:space="preserve">Governments</w:t>
+      </w:r>
+      <w:r>
+        <w:t xml:space="preserve">.”</w:t>
+      </w:r>
+      <w:r>
+        <w:t xml:space="preserve"> </w:t>
+      </w:r>
+      <w:r>
+        <w:rPr>
+          <w:i/>
+          <w:iCs/>
+        </w:rPr>
+        <w:t xml:space="preserve">Review of Policy Research</w:t>
+      </w:r>
+      <w:r>
+        <w:t xml:space="preserve"> </w:t>
+      </w:r>
+      <w:r>
+        <w:t xml:space="preserve">39(4): 468–85.</w:t>
+      </w:r>
+    </w:p>
+    <w:bookmarkEnd w:id="79"/>
+    <w:bookmarkStart w:id="80" w:name="ref-nowlinCulturalTheoryPartisanship2020"/>
     <w:p>
       <w:pPr>
         <w:pStyle w:val="Bibliography"/>
@@ -7488,8 +7828,8 @@
         <w:t xml:space="preserve">101(2): 878–92.</w:t>
       </w:r>
     </w:p>
-    <w:bookmarkEnd w:id="78"/>
-    <w:bookmarkStart w:id="79" w:name="ref-priceMeasuringCulturalValues2014"/>
+    <w:bookmarkEnd w:id="80"/>
+    <w:bookmarkStart w:id="81" w:name="ref-priceMeasuringCulturalValues2014"/>
     <w:p>
       <w:pPr>
         <w:pStyle w:val="Bibliography"/>
@@ -7565,8 +7905,8 @@
         <w:t xml:space="preserve">37: 8–20.</w:t>
       </w:r>
     </w:p>
-    <w:bookmarkEnd w:id="79"/>
-    <w:bookmarkStart w:id="80" w:name="X5ac8eb1d1356972d917d5777697e9a83fe58bbc"/>
+    <w:bookmarkEnd w:id="81"/>
+    <w:bookmarkStart w:id="82" w:name="X5ac8eb1d1356972d917d5777697e9a83fe58bbc"/>
     <w:p>
       <w:pPr>
         <w:pStyle w:val="Bibliography"/>
@@ -7642,8 +7982,8 @@
         <w:t xml:space="preserve">42(4): 509–27.</w:t>
       </w:r>
     </w:p>
-    <w:bookmarkEnd w:id="80"/>
-    <w:bookmarkStart w:id="81" w:name="ref-rosseelLavaanPackageStructural2012"/>
+    <w:bookmarkEnd w:id="82"/>
+    <w:bookmarkStart w:id="83" w:name="ref-rosseelLavaanPackageStructural2012"/>
     <w:p>
       <w:pPr>
         <w:pStyle w:val="Bibliography"/>
@@ -7695,8 +8035,8 @@
         <w:t xml:space="preserve">48(2): 1–36.</w:t>
       </w:r>
     </w:p>
-    <w:bookmarkEnd w:id="81"/>
-    <w:bookmarkStart w:id="82" w:name="ref-sabatierPolicyChangeLearning1993"/>
+    <w:bookmarkEnd w:id="83"/>
+    <w:bookmarkStart w:id="84" w:name="ref-sabatierPolicyChangeLearning1993"/>
     <w:p>
       <w:pPr>
         <w:pStyle w:val="Bibliography"/>
@@ -7781,8 +8121,106 @@
         <w:t xml:space="preserve">. Boulder, CO: Westview Press.</w:t>
       </w:r>
     </w:p>
-    <w:bookmarkEnd w:id="82"/>
-    <w:bookmarkStart w:id="83" w:name="Xcd4128f84630b625b9be8a5d160749108b13e9f"/>
+    <w:bookmarkEnd w:id="84"/>
+    <w:bookmarkStart w:id="85" w:name="ref-sotirovCognitiveTheoryShifting2016"/>
+    <w:p>
+      <w:pPr>
+        <w:pStyle w:val="Bibliography"/>
+      </w:pPr>
+      <w:r>
+        <w:t xml:space="preserve">Sotirov, Metodi, and Georg Winkel. 2016.</w:t>
+      </w:r>
+      <w:r>
+        <w:t xml:space="preserve"> </w:t>
+      </w:r>
+      <w:r>
+        <w:t xml:space="preserve">“Toward a</w:t>
+      </w:r>
+      <w:r>
+        <w:t xml:space="preserve"> </w:t>
+      </w:r>
+      <w:r>
+        <w:t xml:space="preserve">Cognitive Theory</w:t>
+      </w:r>
+      <w:r>
+        <w:t xml:space="preserve"> </w:t>
+      </w:r>
+      <w:r>
+        <w:t xml:space="preserve">of</w:t>
+      </w:r>
+      <w:r>
+        <w:t xml:space="preserve"> </w:t>
+      </w:r>
+      <w:r>
+        <w:t xml:space="preserve">Shifting Coalitions</w:t>
+      </w:r>
+      <w:r>
+        <w:t xml:space="preserve"> </w:t>
+      </w:r>
+      <w:r>
+        <w:t xml:space="preserve">and</w:t>
+      </w:r>
+      <w:r>
+        <w:t xml:space="preserve"> </w:t>
+      </w:r>
+      <w:r>
+        <w:t xml:space="preserve">Policy Change</w:t>
+      </w:r>
+      <w:r>
+        <w:t xml:space="preserve">:</w:t>
+      </w:r>
+      <w:r>
+        <w:t xml:space="preserve"> </w:t>
+      </w:r>
+      <w:r>
+        <w:t xml:space="preserve">Linking</w:t>
+      </w:r>
+      <w:r>
+        <w:t xml:space="preserve"> </w:t>
+      </w:r>
+      <w:r>
+        <w:t xml:space="preserve">the</w:t>
+      </w:r>
+      <w:r>
+        <w:t xml:space="preserve"> </w:t>
+      </w:r>
+      <w:r>
+        <w:t xml:space="preserve">Advocacy Coalition Framework</w:t>
+      </w:r>
+      <w:r>
+        <w:t xml:space="preserve"> </w:t>
+      </w:r>
+      <w:r>
+        <w:t xml:space="preserve">and</w:t>
+      </w:r>
+      <w:r>
+        <w:t xml:space="preserve"> </w:t>
+      </w:r>
+      <w:r>
+        <w:t xml:space="preserve">Cultural Theory</w:t>
+      </w:r>
+      <w:r>
+        <w:t xml:space="preserve">.”</w:t>
+      </w:r>
+      <w:r>
+        <w:t xml:space="preserve"> </w:t>
+      </w:r>
+      <w:r>
+        <w:rPr>
+          <w:i/>
+          <w:iCs/>
+        </w:rPr>
+        <w:t xml:space="preserve">Policy Sciences</w:t>
+      </w:r>
+      <w:r>
+        <w:t xml:space="preserve"> </w:t>
+      </w:r>
+      <w:r>
+        <w:t xml:space="preserve">49(2): 125–54.</w:t>
+      </w:r>
+    </w:p>
+    <w:bookmarkEnd w:id="85"/>
+    <w:bookmarkStart w:id="86" w:name="Xcd4128f84630b625b9be8a5d160749108b13e9f"/>
     <w:p>
       <w:pPr>
         <w:pStyle w:val="Bibliography"/>
@@ -7843,8 +8281,8 @@
         <w:t xml:space="preserve">81: 101780.</w:t>
       </w:r>
     </w:p>
-    <w:bookmarkEnd w:id="83"/>
-    <w:bookmarkStart w:id="84" w:name="Xd80995be13b72525320e599330d3ba78efa80ab"/>
+    <w:bookmarkEnd w:id="86"/>
+    <w:bookmarkStart w:id="87" w:name="Xd80995be13b72525320e599330d3ba78efa80ab"/>
     <w:p>
       <w:pPr>
         <w:pStyle w:val="Bibliography"/>
@@ -7896,8 +8334,8 @@
         <w:t xml:space="preserve">34(3): 291–310.</w:t>
       </w:r>
     </w:p>
-    <w:bookmarkEnd w:id="84"/>
-    <w:bookmarkStart w:id="85" w:name="ref-sternNewEnvironmentalTheories2000"/>
+    <w:bookmarkEnd w:id="87"/>
+    <w:bookmarkStart w:id="88" w:name="ref-sternNewEnvironmentalTheories2000"/>
     <w:p>
       <w:pPr>
         <w:pStyle w:val="Bibliography"/>
@@ -7970,8 +8408,8 @@
         <w:t xml:space="preserve">56(3): 407–24.</w:t>
       </w:r>
     </w:p>
-    <w:bookmarkEnd w:id="85"/>
-    <w:bookmarkStart w:id="86" w:name="X253113b103196daf1c65587a792fbb2f472ac2b"/>
+    <w:bookmarkEnd w:id="88"/>
+    <w:bookmarkStart w:id="89" w:name="X253113b103196daf1c65587a792fbb2f472ac2b"/>
     <w:p>
       <w:pPr>
         <w:pStyle w:val="Bibliography"/>
@@ -8056,8 +8494,8 @@
         <w:t xml:space="preserve">6(2): 81–97.</w:t>
       </w:r>
     </w:p>
-    <w:bookmarkEnd w:id="86"/>
-    <w:bookmarkStart w:id="87" w:name="ref-thompsonCulturalTheory1990"/>
+    <w:bookmarkEnd w:id="89"/>
+    <w:bookmarkStart w:id="90" w:name="ref-thompsonCulturalTheory1990"/>
     <w:p>
       <w:pPr>
         <w:pStyle w:val="Bibliography"/>
@@ -8093,8 +8531,8 @@
         <w:t xml:space="preserve">. Boulder, CO: Westview Press.</w:t>
       </w:r>
     </w:p>
-    <w:bookmarkEnd w:id="87"/>
-    <w:bookmarkStart w:id="88" w:name="ref-tumlisonWhatExplainsLocal2018"/>
+    <w:bookmarkEnd w:id="90"/>
+    <w:bookmarkStart w:id="91" w:name="ref-tumlisonWhatExplainsLocal2018"/>
     <w:p>
       <w:pPr>
         <w:pStyle w:val="Bibliography"/>
@@ -8149,8 +8587,8 @@
         <w:t xml:space="preserve">117: 377–86.</w:t>
       </w:r>
     </w:p>
-    <w:bookmarkEnd w:id="88"/>
-    <w:bookmarkStart w:id="89" w:name="Xb710d7d8977db263a9186d05b028690def8f336"/>
+    <w:bookmarkEnd w:id="91"/>
+    <w:bookmarkStart w:id="92" w:name="Xb710d7d8977db263a9186d05b028690def8f336"/>
     <w:p>
       <w:pPr>
         <w:pStyle w:val="Bibliography"/>
@@ -8211,9 +8649,9 @@
         <w:t xml:space="preserve">40.</w:t>
       </w:r>
     </w:p>
-    <w:bookmarkEnd w:id="89"/>
-    <w:bookmarkEnd w:id="90"/>
-    <w:bookmarkEnd w:id="91"/>
+    <w:bookmarkEnd w:id="92"/>
+    <w:bookmarkEnd w:id="93"/>
+    <w:bookmarkEnd w:id="94"/>
     <w:sectPr>
       <w:headerReference r:id="rId12" w:type="even"/>
       <w:headerReference r:id="rId13" w:type="default"/>

</xml_diff>

<commit_message>
Merge two rounds of coauthor track-changes, drop stale supplement reference, add abstract
Incorporates all accepted edits from Aaron Sparks' two Word track-changes
reviews (Nowlin_Sparks_AS.docx: 22 changes; Behaving Sustainably.docx: 232
insertions/226 deletions across 47 paragraphs) via a three-way merge that
preserves citation keys, cross-references, footnotes, and inline R code.
Also removes a stale reference to supplemental materials from the
fig-structural caption, adds the abstract to README.md, and ignores the
coauthor review copies and submission-prep folder.

Co-Authored-By: Claude Sonnet 5 <noreply@anthropic.com>
</commit_message>
<xml_diff>
--- a/_output/cc-behave.docx
+++ b/_output/cc-behave.docx
@@ -7,7 +7,7 @@
         <w:pStyle w:val="Title"/>
       </w:pPr>
       <w:r>
-        <w:t xml:space="preserve">Behaving Sustainability: Cultural Cognition, Environmental Orientation, and Pro-Environmental Behavior</w:t>
+        <w:t xml:space="preserve">Behaving Sustainably: Cultural Cognition, Environmental Orientation, and Pro-Environmental Behavior</w:t>
       </w:r>
     </w:p>
     <w:p>
@@ -36,6 +36,48 @@
           <w:rStyle w:val="FootnoteReference"/>
         </w:rPr>
         <w:footnoteReference w:id="10"/>
+      </w:r>
+    </w:p>
+    <w:p>
+      <w:pPr>
+        <w:pStyle w:val="FirstParagraph"/>
+      </w:pPr>
+      <w:r>
+        <w:rPr>
+          <w:b/>
+          <w:bCs/>
+        </w:rPr>
+        <w:t xml:space="preserve">Abstract</w:t>
+      </w:r>
+      <w:r>
+        <w:t xml:space="preserve">: Scholars has long noted an</w:t>
+      </w:r>
+      <w:r>
+        <w:t xml:space="preserve"> </w:t>
+      </w:r>
+      <w:r>
+        <w:t xml:space="preserve">“attitude-behavior gap”</w:t>
+      </w:r>
+      <w:r>
+        <w:t xml:space="preserve"> </w:t>
+      </w:r>
+      <w:r>
+        <w:t xml:space="preserve">which reflects an incomplete understanding of how values and beliefs translate into pro-environmental action. This study develops and tests a conceptual model in which cultural worldviews along grid (hierarchy-egalitarianism) and group (individualism-communitarianism) dimensions shape environmental orientations, which in turn drive pro-environmental behavior. Environmental orientation is treated as having a cognitive component, measured by the New Ecological Paradigm (NEP), and an affective component, measured by the Connectedness to Nature Scale (CNS). Using survey data from 501 US adults collected online in July 2017, we estimate a Structural Equation Model (SEM) to test direct, indirect, and mediated relationships among cultural worldviews, the NEP, the CNS, and a 12-item self-reported behavior scale. Results showed hierarchical individualists held weaker ecological worldviews, while egalitarian communitarians held stronger ecological worldviews and felt more connected to nature. Both the NEP and CNS were positively associated with behavior, with the CNS showing the stronger relationship. Cultural worldviews had no significant direct effect on behavior, rather their influence operated entirely through environmental orientations. These findings indicate that cultural worldviews shape pro-environmental behavior indirectly, mediated by cognitive and especially affective environmental orientations, helping to explain part of the attitude-behavior gap.</w:t>
+      </w:r>
+    </w:p>
+    <w:p>
+      <w:pPr>
+        <w:pStyle w:val="BodyText"/>
+      </w:pPr>
+      <w:r>
+        <w:rPr>
+          <w:b/>
+          <w:bCs/>
+        </w:rPr>
+        <w:t xml:space="preserve">Keywords</w:t>
+      </w:r>
+      <w:r>
+        <w:t xml:space="preserve">: Pro-environmental behaviors; cultural cognition; ecological worldview; connected to nature</w:t>
       </w:r>
     </w:p>
     <w:bookmarkStart w:id="11" w:name="introduction"/>
@@ -70,7 +112,7 @@
         <w:t xml:space="preserve">(Gifford and Nilsson 2014; Kollmuss and Agyeman 2002; Stern 2000)</w:t>
       </w:r>
       <w:r>
-        <w:t xml:space="preserve">. If people care strongly about the environment, why don’t they act in a more sustainable way? The attitude-behavior gap is not because people are hypocrites, but because researchers do not yet have a complete attitude-behavior model</w:t>
+        <w:t xml:space="preserve">. If people care strongly about the environment, why do they not act in a more sustainable way? The attitude-behavior gap is not because people are hypocrites but because researchers do not yet have a complete attitude-behavior model</w:t>
       </w:r>
       <w:r>
         <w:t xml:space="preserve"> </w:t>
@@ -114,7 +156,7 @@
         <w:t xml:space="preserve">(Henry and Dietz 2012; Stern and Dietz 1994)</w:t>
       </w:r>
       <w:r>
-        <w:t xml:space="preserve">. In addition to environmental cognition, there are also affective feelings that individuals hold about the environment</w:t>
+        <w:t xml:space="preserve">. In addition to environmental cognition, individuals also have affective feelings about the environment</w:t>
       </w:r>
       <w:r>
         <w:t xml:space="preserve"> </w:t>
@@ -123,7 +165,7 @@
         <w:t xml:space="preserve">(Gkargkavouzi, Halkos, and Matsiori 2019; Mayer and Frantz 2004)</w:t>
       </w:r>
       <w:r>
-        <w:t xml:space="preserve">. Together environmental cognition and affective feelings form an environmental orientation that shapes environmental behaviors. However, to develop a complete attitude-behavior model, it is important to understand all of the various links in the chain, including the higher-order values and cognition that inform environmental orientations. Of note, the cultural worldviews measured by cultural cognition have been shown to shape environmental orientations</w:t>
+        <w:t xml:space="preserve">. Together, environmental cognition and affective feelings form an environmental orientation that shapes environmental behaviors. However, to develop a complete attitude-behavior model, it is important to understand the various links in the chain, including the higher-order values and cognition that inform environmental orientations. Of note, the cultural worldviews measured by cultural cognition have been shown to shape environmental orientations</w:t>
       </w:r>
       <w:r>
         <w:t xml:space="preserve"> </w:t>
@@ -158,7 +200,7 @@
         <w:t xml:space="preserve">(Douglas and Wildavsky 1982; Kahan 2012)</w:t>
       </w:r>
       <w:r>
-        <w:t xml:space="preserve">. Cultural theory addresses how cultural values influence how people perceive and respond to risk. By measuring the cultural values of an individual, we may be able to predict how they will perceive and respond to risks associated with certain activities or products. We are interested in how cultural cognition shapes views toward environmental issues and how those views shape behavior. Cultural worldviews their subsequent risk perceptions are likely strong drivers of environmental orientation because of the nature of environmental problems typically involves elements of risk or harm to the environment.</w:t>
+        <w:t xml:space="preserve">. Cultural theory addresses how cultural values influence people’s perceptions of and responses to risk. By measuring an individual’s cultural values, we may be able to predict how they will perceive and respond to risks associated with certain activities or products. We are interested in how cultural cognition shapes views toward environmental issues and how these views shape behavior. Cultural worldviews and their subsequent risk perceptions are likely strong drivers of environmental orientation because environmental problems typically involve elements of risk or harm to the environment.</w:t>
       </w:r>
     </w:p>
     <w:p>
@@ -166,7 +208,7 @@
         <w:pStyle w:val="BodyText"/>
       </w:pPr>
       <w:r>
-        <w:t xml:space="preserve">The cultural worldviews associated with cultural cognition are measured in two dimensions, a grid dimension (egalitarianism-hierarchy) and a group dimension (communitarianism-individualism). In general, those that are more egalitarian and communitarian are more concerned about environmental risks than those that are more hierarchical and individualist. Therefore, it is expected that individuals high in egalitarianism and communitarianism should engage in pro-environmental behaviors to mitigate risks to the natural environment. However, previous research shows only a weak correlation between egalitarianism and communitarianism and pro-environmental behavior</w:t>
+        <w:t xml:space="preserve">The cultural worldviews associated with cultural cognition are measured in two dimensions, a grid dimension (egalitarianism-hierarchy) and a group dimension (communitarianism-individualism). In general, those who are more egalitarian and communitarian are more concerned about environmental risks than those who are more hierarchical and individualist. Therefore, it is expected that individuals high in egalitarianism and communitarianism should engage in pro-environmental behaviors to mitigate risks to the natural environment. However, previous research has shown only a weak correlation between egalitarianism, communitarianism, and pro-environmental behavior</w:t>
       </w:r>
       <w:r>
         <w:t xml:space="preserve"> </w:t>
@@ -175,7 +217,7 @@
         <w:t xml:space="preserve">(Sparks et al. 2021)</w:t>
       </w:r>
       <w:r>
-        <w:t xml:space="preserve">. Therefore, cultural cognition shapes how individuals think and process information about issues, but may not directly influence behaviors.</w:t>
+        <w:t xml:space="preserve">. Therefore, cultural cognition shapes how individuals think and process information about issues but may not directly influence behaviors.</w:t>
       </w:r>
     </w:p>
     <w:p>
@@ -183,7 +225,7 @@
         <w:pStyle w:val="BodyText"/>
       </w:pPr>
       <w:r>
-        <w:t xml:space="preserve">In this paper, we develop a conceptual framework that accounts for both the cognitive and affective influences on pro-environmental behavior. Specifically, we posit that that higher-order beliefs, drawn from cultural cognition</w:t>
+        <w:t xml:space="preserve">In this paper, we develop a conceptual framework that accounts for both the cognitive and affective influences on pro-environmental behavior. Specifically, we posit that higher-order beliefs, drawn from cultural cognition</w:t>
       </w:r>
       <w:r>
         <w:t xml:space="preserve"> </w:t>
@@ -201,7 +243,7 @@
         <w:t xml:space="preserve">(Henry and Dietz 2012)</w:t>
       </w:r>
       <w:r>
-        <w:t xml:space="preserve">, which in turn influence behavior, both public and private. Drawing from</w:t>
+        <w:t xml:space="preserve">, which in turn influence both public and private behavior. Drawing from</w:t>
       </w:r>
       <w:r>
         <w:t xml:space="preserve"> </w:t>
@@ -210,7 +252,7 @@
         <w:t xml:space="preserve">Henry and Dietz (2012)</w:t>
       </w:r>
       <w:r>
-        <w:t xml:space="preserve">, we use the New Ecological Paradigm (NEP) as our measure of environmental cognition, and the Connectedness to Nature Scale (CNS) as the affective element of environmental orientation. Previous work failed to find that cultural cognition influence environmental behavior; however, it has been found to influence environmental cognition using the NEP</w:t>
+        <w:t xml:space="preserve">, we use the New Ecological Paradigm (NEP) as our measure of environmental cognition and the Connectedness to Nature Scale (CNS) as the affective element of environmental orientation. Previous work failed to find that cultural cognition influences environmental behavior; however, it has been found to influence environmental cognition using the NEP</w:t>
       </w:r>
       <w:r>
         <w:t xml:space="preserve"> </w:t>
@@ -227,7 +269,7 @@
         <w:pStyle w:val="BodyText"/>
       </w:pPr>
       <w:r>
-        <w:t xml:space="preserve">Overall, we find egalitarian communitarians hold an ecological worldview and feel more connected to nature. However, hierarchial individualists are less concern about the environment than other worldviews. Additionally, we find that ecological worldviews are associated with feeling connected to nature, and that both worldviews and affective nature connection are associated with increase in self-reported pro-environmental behaviors. Finally, we find that environmental orientations mediate the relationship between cultural worldviews and behaviors, meaning that cultural worldviews play an important, but indirect, role in environmental behaviors.</w:t>
+        <w:t xml:space="preserve">Overall, we found that egalitarian communitarians hold an ecological worldview and feel more connected to nature. However, hierarchical individualists are less concerned about the environment than those with other worldviews. Additionally, we find that ecological worldviews are associated with feeling connected to nature, and that both worldviews and affective nature connection are associated with an increase in self-reported pro-environmental behaviors. Finally, we find that environmental orientations mediate the relationship between cultural worldviews and behaviors, meaning that cultural worldviews play an important, but indirect, role in environmental behaviors.</w:t>
       </w:r>
     </w:p>
     <w:bookmarkEnd w:id="11"/>
@@ -245,7 +287,7 @@
         <w:pStyle w:val="FirstParagraph"/>
       </w:pPr>
       <w:r>
-        <w:t xml:space="preserve">The process though values and beliefs impact behavior is often understood as a process where higher-order, antecedent values influence second-order beliefs, which in turn influence behavior</w:t>
+        <w:t xml:space="preserve">The process through which values and beliefs impact behavior is often understood as a process where higher-order, antecedent values influence second-order beliefs, which in turn influence behavior</w:t>
       </w:r>
       <w:r>
         <w:t xml:space="preserve"> </w:t>
@@ -263,7 +305,7 @@
         <w:t xml:space="preserve">(Stern et al. 1999; Stern 2000)</w:t>
       </w:r>
       <w:r>
-        <w:t xml:space="preserve">. In brief, the VBN posits that underlining values inform broad environmental orientations that activate norms that in turn support pro-environmental behavior. VBN involves a sequential chain that goes from values to beliefs to behavior. Therefore, values inform attitudes, which in turn inform behaviors.</w:t>
+        <w:t xml:space="preserve">. In brief, the VBN posits that underlying values inform broad environmental orientations that activate norms that, in turn, support pro-environmental behavior. VBN involves a sequential chain that goes from values to beliefs to behavior. Therefore, values inform attitudes, which in turn inform behavior.</w:t>
       </w:r>
     </w:p>
     <w:p>
@@ -271,7 +313,7 @@
         <w:pStyle w:val="BodyText"/>
       </w:pPr>
       <w:r>
-        <w:t xml:space="preserve">As noted, the VBN framework moves from values to beliefs to norms to pro-environmental behaviors. The values that have been identified and applied include biospheric, altruistic, and egoistic</w:t>
+        <w:t xml:space="preserve">As noted, the VBN framework moves from values to beliefs to norms to pro-environmental behaviors. The values that have been identified and applied include biospheric, altruistic, and egoistic values</w:t>
       </w:r>
       <w:r>
         <w:t xml:space="preserve"> </w:t>
@@ -280,7 +322,7 @@
         <w:t xml:space="preserve">(Canlas, Karpudewan, and Khan 2022; Stern 2000)</w:t>
       </w:r>
       <w:r>
-        <w:t xml:space="preserve">. Biospheric values are associated with concern for the environment, altruistic values involved concern for others, and egoistic values involve concern for self</w:t>
+        <w:t xml:space="preserve">. Biospheric values are associated with concern for the environment, altruistic values involve concern for others, and egoistic values shape concern for self</w:t>
       </w:r>
       <w:r>
         <w:t xml:space="preserve"> </w:t>
@@ -298,7 +340,7 @@
         <w:t xml:space="preserve">(Chen 2015; Fornara et al. 2020; Slimak and Dietz 2006; Stern et al. 1999)</w:t>
       </w:r>
       <w:r>
-        <w:t xml:space="preserve">. Additional beliefs include an awareness of consequences (AC) and an ascription of responsibility (AR), which active norms involving a sense of obligation to action</w:t>
+        <w:t xml:space="preserve">. Additional beliefs include awareness of consequences (AC) and ascription of responsibility (AR), which are active norms involving a sense of obligation to act</w:t>
       </w:r>
       <w:r>
         <w:t xml:space="preserve"> </w:t>
@@ -307,7 +349,7 @@
         <w:t xml:space="preserve">(Stern 2000)</w:t>
       </w:r>
       <w:r>
-        <w:t xml:space="preserve">. The behaviors identified include private consumption-based behaviors, public facing activism, and support for environmental policies</w:t>
+        <w:t xml:space="preserve">. The behaviors identified include private consumption-based behaviors, public-facing activism, and support for environmental policies</w:t>
       </w:r>
       <w:r>
         <w:t xml:space="preserve"> </w:t>
@@ -381,7 +423,7 @@
         <w:t xml:space="preserve">(Henry and Dietz 2012; Nohrstedt et al. 2023; Sabatier and Jenkins-Smith 1993)</w:t>
       </w:r>
       <w:r>
-        <w:t xml:space="preserve">. With this approach, beliefs systems are interrelated beliefs made up of three different types, including deep core, policy core, and secondary beliefs. Deep core beliefs are the broadest in scope and are fundamental beliefs that inform attitudes about multiple issues. They tend to be stable, and play a role in how issues are understood and they influence reasoning about issues</w:t>
+        <w:t xml:space="preserve">. With this approach, belief systems are interrelated beliefs made up of three different types, including deep core, policy core, and secondary beliefs. Deep core beliefs are the broadest in scope and are fundamental beliefs that inform attitudes toward multiple issues. They tend to be stable, play a role in how issues are understood, and influence reasoning about issues</w:t>
       </w:r>
       <w:r>
         <w:t xml:space="preserve"> </w:t>
@@ -390,7 +432,7 @@
         <w:t xml:space="preserve">(Kahan et al. 2012; Nohrstedt et al. 2023)</w:t>
       </w:r>
       <w:r>
-        <w:t xml:space="preserve">. Biospheric, altruistic, and egoistic values, could seen as examples of deep core beliefs, as could political ideology. Next, are policy core beliefs, which are beliefs about particular issues. Environmental orientations would be akin to policy core beliefs. Finally, secondary aspects are the narrowest in scope and include beliefs about how best to achieve the goals outlined in policy core beliefs. We aim to develop previous work that noted a connection between VBN and the ACF</w:t>
+        <w:t xml:space="preserve">. Biospheric, altruistic, and egoistic values, as well as political ideology, can be seen as examples of deep core beliefs. Next, are policy core beliefs, which are beliefs about particular issues. Environmental orientations would be akin to policy core beliefs. Finally, secondary aspects are the narrowest in scope and include beliefs about how to best achieve the goals outlined in policy core beliefs. We aim to build on previous work that noted a connection between the VBN and the ACF</w:t>
       </w:r>
       <w:r>
         <w:t xml:space="preserve"> </w:t>
@@ -432,7 +474,7 @@
         <w:t xml:space="preserve">(Liobikienė and Poškus 2019; Ripberger et al. 2014)</w:t>
       </w:r>
       <w:r>
-        <w:t xml:space="preserve">. Our measure of deep core beliefs is cultural cognition, which as the name implies, involve deeply rooted values and beliefs that influence cognition. For environmental orientations, we draw on environmental cognition, which is</w:t>
+        <w:t xml:space="preserve">. Our measure of deep core beliefs is cultural cognition, which, as the name implies, involves deeply rooted values and beliefs that influence cognition. For environmental orientations, we draw on environmental cognition, which is</w:t>
       </w:r>
       <w:r>
         <w:t xml:space="preserve"> </w:t>
@@ -447,7 +489,7 @@
         <w:t xml:space="preserve">(Henry and Dietz 2012, 238)</w:t>
       </w:r>
       <w:r>
-        <w:t xml:space="preserve">. We argue that environmental orientations contain a cognitive element as well as an affective element. Deep core beliefs influence both the cognitive and affective aspects of environmental orientations. Finally, deep core beliefs and environmental orientations influence pro-environmental behaviors; however, it is not clear if deep core beliefs influence behaviors directly</w:t>
+        <w:t xml:space="preserve">. We argue that environmental orientations contain both cognitive and affective elements. Deep core beliefs influence both the cognitive and affective aspects of environmental orientations. Finally, deep core beliefs and environmental orientations influence pro-environmental behaviors; however, it is not clear whether deep core beliefs influence behaviors directly</w:t>
       </w:r>
       <w:r>
         <w:t xml:space="preserve"> </w:t>
@@ -512,7 +554,7 @@
         <w:t xml:space="preserve">(Ripberger et al. 2014)</w:t>
       </w:r>
       <w:r>
-        <w:t xml:space="preserve">. In brief, CT posits that social structures and relationships are represented by two dimensions, including a grid dimension and a group dimension. Four competing cultural worldviews are possible based on positioning in the grid and group dimensional space. The grid dimension represents preferred social structures regarding the roles that one plays in society and the rules by which one must abide. The group dimension represents the importance of cohesive social units and the well-being of the broader community. The original formulation of CT produces four cultural worldviews based on the relative positions on the grid and group dimensions, including hierarchy (high grid, high group), egalitarianism (low grid, high group), individualism (low grid, and low group), and fatalism (high grid, low group).</w:t>
+        <w:t xml:space="preserve">. In brief, CT posits that social structures and relationships are represented by two dimensions, including a grid dimension and a group dimension. Four competing cultural worldviews are possible based on their positioning in the grid and group dimensional space. The grid dimension represents preferred social structures regarding the roles that one plays in society and the rules by which one must abide. The group dimension represents the importance of cohesive social units and the well-being of the broader community. The original formulation of CT produces four cultural worldviews based on the relative positions on the grid and group dimensions, including hierarchy (high grid, high group), egalitarianism (low grid, high group), individualism (low grid, and low group), and fatalism (high grid, low group).</w:t>
       </w:r>
     </w:p>
     <w:p>
@@ -609,7 +651,7 @@
         <w:pStyle w:val="BodyText"/>
       </w:pPr>
       <w:r>
-        <w:t xml:space="preserve">Cultural cognition is based on CT and its cultural worldviews, but makes two important distinctions. The first is its focus on social and psychological mechanisms that underlie how worldviews influence opinion on contested political and policy issues. Cultural commitments occur prior to facts,</w:t>
+        <w:t xml:space="preserve">Cultural cognition is based on CT and its cultural worldviews but makes two important distinctions. The first is its focus on the social and psychological mechanisms that underlie how worldviews influence opinions on contested political and policy issues. Cultural commitments occur prior to facts,</w:t>
       </w:r>
       <w:r>
         <w:t xml:space="preserve"> </w:t>
@@ -640,7 +682,7 @@
         <w:t xml:space="preserve">(Kahan and Braman 2006, 148)</w:t>
       </w:r>
       <w:r>
-        <w:t xml:space="preserve">. Individuals rely on five mechanisms to ensure that their positions on issues are congruent with their cultural worldviews. These mechanisms include, 1)</w:t>
+        <w:t xml:space="preserve">. Individuals rely on five mechanisms to ensure that their positions on issues are congruent with their cultural worldviews. These mechanisms include: 1)</w:t>
       </w:r>
       <w:r>
         <w:t xml:space="preserve"> </w:t>
@@ -678,7 +720,7 @@
         <w:t xml:space="preserve">culturally biased assimilation and cultural polarization</w:t>
       </w:r>
       <w:r>
-        <w:t xml:space="preserve">, involves selective attention to worldview-confirming information and balanced information tends drives people of opposing worldviews further apart rather than together; 3)</w:t>
+        <w:t xml:space="preserve">, which involves selective attention to worldview-confirming information and balanced information that tends to drive people of opposing worldviews further apart rather than together; 3)</w:t>
       </w:r>
       <w:r>
         <w:t xml:space="preserve"> </w:t>
@@ -691,10 +733,7 @@
         <w:t xml:space="preserve">cultural availability</w:t>
       </w:r>
       <w:r>
-        <w:t xml:space="preserve"> </w:t>
-      </w:r>
-      <w:r>
-        <w:t xml:space="preserve">occurs as worldview-confirming events and experts are more readily noticed, credited, and recalled; 4)</w:t>
+        <w:t xml:space="preserve">, which occurs as worldview-confirming events and experts are more readily noticed, credited, and recalled; 4)</w:t>
       </w:r>
       <w:r>
         <w:t xml:space="preserve"> </w:t>
@@ -707,10 +746,7 @@
         <w:t xml:space="preserve">cultural credibility heuristic</w:t>
       </w:r>
       <w:r>
-        <w:t xml:space="preserve"> </w:t>
-      </w:r>
-      <w:r>
-        <w:t xml:space="preserve">is when people trust sources whose apparent values match their own; and 5)</w:t>
+        <w:t xml:space="preserve">, when people trust sources whose apparent values match their own; and 5)</w:t>
       </w:r>
       <w:r>
         <w:t xml:space="preserve"> </w:t>
@@ -723,7 +759,7 @@
         <w:t xml:space="preserve">cultural-identity affirmation</w:t>
       </w:r>
       <w:r>
-        <w:t xml:space="preserve">, has been show when framing information alongside an identity-affirming rather than identity-threatening policy solution makes people more receptive to the underlying facts</w:t>
+        <w:t xml:space="preserve">, which has been shown when framing information alongside an identity-affirming rather than identity-threatening policy solution makes people more receptive to the underlying facts</w:t>
       </w:r>
       <w:r>
         <w:t xml:space="preserve"> </w:t>
@@ -732,7 +768,7 @@
         <w:t xml:space="preserve">(Kahan 2012)</w:t>
       </w:r>
       <w:r>
-        <w:t xml:space="preserve">. Together, these mechanisms account for the cognition part of cultural cognition.</w:t>
+        <w:t xml:space="preserve">. Together, these mechanisms account for the cognitive aspect of cultural cognition.</w:t>
       </w:r>
     </w:p>
     <w:p>
@@ -740,7 +776,7 @@
         <w:pStyle w:val="BodyText"/>
       </w:pPr>
       <w:r>
-        <w:t xml:space="preserve">The second distinction of cultural cognition from CT is how cultural worldviews are measured empirically. As noted, the CT worldviews are based on the placement on the grid and group dimensions, and worldviews are a result of placement on both. However, cultural cognition conceives grid and group as two orthogonal dimensions with worldviews identified as being high or low on each dimension rather than a combination of the dimensions. Those high on the grid dimension are called hierarchical as they prefer a society with well-defined roles and clear lines of authority, whereas those low on the grid dimension are termed egalitarian as they value a social order based on an equal sharing of power and resources. Communitarian is the worldview that is high on the group dimension, and it represents a preference for a collectivist society. Finally, individualism is low on the group dimension preferring increased individual autonomy and responsibility</w:t>
+        <w:t xml:space="preserve">The second distinction between cultural cognition and CT is how cultural worldviews are measured empirically. As noted, the CT worldviews are based on the placement on the grid and group dimensions, and worldviews are a result of placement on both. However, cultural cognition conceives grid and group as two orthogonal dimensions, with worldviews identified as being high or low on each dimension rather than a combination of the dimensions. Those high on the grid dimension are called hierarchical, as they prefer a society with well-defined roles and clear lines of authority, whereas those low on the grid dimension are termed egalitarian, as they value a social order based on an equal sharing of power and resources. Communitarianism is the worldview that is high on the group dimension and represents a preference for a collectivist society. Finally, individualism is low on the group dimension, preferring increased individual autonomy and responsibility</w:t>
       </w:r>
       <w:r>
         <w:t xml:space="preserve"> </w:t>
@@ -787,10 +823,7 @@
         <w:t xml:space="preserve">(Overdevest and Christiansen 2013)</w:t>
       </w:r>
       <w:r>
-        <w:t xml:space="preserve"> </w:t>
-      </w:r>
-      <w:r>
-        <w:t xml:space="preserve">In terms of the influence of cultural cognition and pro-environmental behavior, the results are somewhat mixed. One study found that hierarchy and individualism predicted fewer self-reported pro-environment behaviors</w:t>
+        <w:t xml:space="preserve">. In terms of the influence of cultural cognition and pro-environmental behavior, the results are somewhat mixed. One study found that hierarchy and individualism predicted fewer self-reported pro-environment behaviors</w:t>
       </w:r>
       <w:r>
         <w:t xml:space="preserve"> </w:t>
@@ -816,7 +849,7 @@
         <w:pStyle w:val="BodyText"/>
       </w:pPr>
       <w:r>
-        <w:t xml:space="preserve">As a measure of deep core beliefs, cultural cognition will likely have an indirect association with environmental behaviors, meaning that the relationship will be mediated by environmental orientations. Indeed, cultural cognition is associated with pro-environmental orientation, specifically the New Ecological Paradigm (NEP)</w:t>
+        <w:t xml:space="preserve">As a measure of deep core beliefs, cultural cognition will likely have an indirect association with environmental behaviors, meaning that the relationship will be mediated by environmental orientations. Indeed, cultural cognition worldviews, specifically egalitarianism and communitarianism are associated with pro-environmental orientation, specifically the New Ecological Paradigm (NEP)</w:t>
       </w:r>
       <w:r>
         <w:t xml:space="preserve"> </w:t>
@@ -843,7 +876,7 @@
         <w:pStyle w:val="FirstParagraph"/>
       </w:pPr>
       <w:r>
-        <w:t xml:space="preserve">Moving from deep core beliefs to environmental orientations, of first measure of environmental orientations is the New Ecological Paradigm (NEP). The NEP, developed in 1978</w:t>
+        <w:t xml:space="preserve">Moving from deep core beliefs to environmental orientations, the first measure of environmental orientations is the New Ecological Paradigm (NEP). The NEP, developed in 1978</w:t>
       </w:r>
       <w:r>
         <w:t xml:space="preserve"> </w:t>
@@ -870,7 +903,7 @@
         <w:t xml:space="preserve">(e.g., Stern 2000)</w:t>
       </w:r>
       <w:r>
-        <w:t xml:space="preserve">. It’s original development focused on explaining the values associated with environmentalism as an emergent environmental paradigm that challenged the dominant social paradigm. Central to the NEP is concern about the environment and beliefs about the proper relationship between humans and the natural world</w:t>
+        <w:t xml:space="preserve">. Its original development focused on explaining the values associated with environmentalism as an emergent environmental paradigm that challenged the dominant social paradigm. Central to the NEP is the concern about the environment and beliefs about the proper relationship between humans and the natural world</w:t>
       </w:r>
       <w:r>
         <w:t xml:space="preserve"> </w:t>
@@ -896,7 +929,7 @@
         <w:pStyle w:val="BodyText"/>
       </w:pPr>
       <w:r>
-        <w:t xml:space="preserve">In our approach, we view the NEP as an ecological worldview that encompass values associated with the environment, and, like cultural cognition works to ensure that an individual’s beliefs about the environment remain congruent with their ecological worldview. As a worldview, the NEP measures the environmental cognition that shapes how the natural world is seen</w:t>
+        <w:t xml:space="preserve">In our approach, we view the NEP as an ecological worldview that encompasses values associated with the environment, and like cultural cognition, works to ensure that an individual’s beliefs about the environment remain congruent with their ecological worldview. As a worldview, the NEP measures the environmental cognition that shapes how the natural world is seen</w:t>
       </w:r>
       <w:r>
         <w:t xml:space="preserve"> </w:t>
@@ -922,7 +955,7 @@
         <w:pStyle w:val="BodyText"/>
       </w:pPr>
       <w:r>
-        <w:t xml:space="preserve">There are some significant critiques of the NEP. One study applying scale analysis of the NEP based on a random sample of Norwegians found that the scale is not unidimensional as is often claimed</w:t>
+        <w:t xml:space="preserve">There are some significant critiques of the NEP. One study applying scale analysis of the NEP based on a random sample of Norwegians found that the scale is not unidimensional, as is often claimed</w:t>
       </w:r>
       <w:r>
         <w:t xml:space="preserve"> </w:t>
@@ -943,7 +976,7 @@
         <w:t xml:space="preserve"> </w:t>
       </w:r>
       <w:r>
-        <w:t xml:space="preserve">criticize the NEP for failing to adequately identify political conservatives who also hold a pro-environment orientation. Most important for our purposes is a study that found the NEP to be a relatively weak predictor of self-reported pro-environmental behavior, accounting for 12% of the variation, when compared in the same sample to the Connectedness to Nature Scale and environmentalist identity</w:t>
+        <w:t xml:space="preserve">criticized the NEP for failing to adequately identify political conservatives who also hold a pro-environment orientation. Most important for our purposes is a study that found the NEP to be a relatively weak predictor of self-reported pro-environmental behavior, accounting for 12% of the variation when compared in the same sample to the Connectedness to Nature Scale and environmentalist identity</w:t>
       </w:r>
       <w:r>
         <w:t xml:space="preserve"> </w:t>
@@ -961,7 +994,7 @@
         <w:t xml:space="preserve">(Lou et al. 2022)</w:t>
       </w:r>
       <w:r>
-        <w:t xml:space="preserve">, or it may be that feeling close and connected to nature is more proximate to behavior than more abstract, cognitive worldviews like cultural cognition and the NEP.</w:t>
+        <w:t xml:space="preserve">, or it may be that feeling close and connected to nature is more proximate to behavior than more abstract, cognitive worldviews, such as cultural cognition and the NEP.</w:t>
       </w:r>
     </w:p>
     <w:bookmarkEnd w:id="13"/>
@@ -979,7 +1012,7 @@
         <w:pStyle w:val="FirstParagraph"/>
       </w:pPr>
       <w:r>
-        <w:t xml:space="preserve">Our second instrument measuring environmental orientation is the Connectedness to Nature Scale (CNS)</w:t>
+        <w:t xml:space="preserve">Our second instrument for measuring environmental orientation is the Connectedness to Nature Scale (CNS)</w:t>
       </w:r>
       <w:r>
         <w:t xml:space="preserve"> </w:t>
@@ -988,7 +1021,7 @@
         <w:t xml:space="preserve">(Mayer and Frantz 2004)</w:t>
       </w:r>
       <w:r>
-        <w:t xml:space="preserve">. The CNS seeks to measure an individual’s emotional connection to nature, rather than a cognitive environmental worldview. The CNS is based on the notion that to address environmental problems, people must feel emotionally connected to the non-human community on which we are dependent upon. The idea is that current ecological crises are a direct result of humanity losing touch with the broader community in which we live. As we argue, the NEP captures a cognitive element of environmental orientations and feeling connected to nature capture an affective element.</w:t>
+        <w:t xml:space="preserve">. The CNS seeks to measure an individual’s emotional connection to nature rather than a cognitive environmental worldview. The CNS is based on the notion that to address environmental problems, people must feel emotionally connected to the non-human community on which they are dependent. The idea is that the current ecological crises are a direct result of humanity losing touch with the broader community in which we live. As we argue, the NEP captures the cognitive element of environmental orientation, and feeling connected to nature captures the affective element.</w:t>
       </w:r>
     </w:p>
     <w:p>
@@ -996,7 +1029,7 @@
         <w:pStyle w:val="BodyText"/>
       </w:pPr>
       <w:r>
-        <w:t xml:space="preserve">Research on connectedness to nature consistently suggests that people who feel more psychologically linked to the natural world are more likely to engage in pro-environmental behavior. Two meta-analyses found strong and consistent positive relationships between pro-environmental behavior and a connection to nature</w:t>
+        <w:t xml:space="preserve">Research on connectedness to nature consistently suggests that people who feel more psychologically linked to the natural world are more likely to engage in pro-environmental behavior. Two meta-analyses found strong and consistent positive relationships between pro-environmental behavior and connection to nature</w:t>
       </w:r>
       <w:r>
         <w:t xml:space="preserve"> </w:t>
@@ -1014,7 +1047,7 @@
         <w:t xml:space="preserve">(Nisbet, Zelenski, and Murphy 2009)</w:t>
       </w:r>
       <w:r>
-        <w:t xml:space="preserve">. More recent work extends this finding across multiple behavioral domains, including civic action, recycling, household conservation, and consumer choices, were all predicted by connectedness to nature, whereas policy support and transportation were predict by environmental concern, which included the NEP</w:t>
+        <w:t xml:space="preserve">. More recent work extends this finding across multiple behavioral domains, including civic action, recycling, household conservation, and consumer choices, which were all predicted by connectedness to nature, whereas policy support and transportation were predicted by environmental concern, which included the NEP</w:t>
       </w:r>
       <w:r>
         <w:t xml:space="preserve"> </w:t>
@@ -1023,7 +1056,7 @@
         <w:t xml:space="preserve">(Gkargkavouzi, Halkos, and Matsiori 2019)</w:t>
       </w:r>
       <w:r>
-        <w:t xml:space="preserve">. One study assessed the role of personality traits on environmental behavior, and provided a comparison of the mediation effect of both the NEP and the CNS on environmental behaviors</w:t>
+        <w:t xml:space="preserve">. One study assessed the role of personality traits in environmental behavior and provided a comparison of the mediation effect of both the NEP and the CNS on environmental behaviors</w:t>
       </w:r>
       <w:r>
         <w:t xml:space="preserve"> </w:t>
@@ -1032,7 +1065,7 @@
         <w:t xml:space="preserve">(Brick and Lewis 2016)</w:t>
       </w:r>
       <w:r>
-        <w:t xml:space="preserve">. The personality traits Openness and Conscientiousness were both shown to be positive predictors of environmental behavior. In both cases, the CNS had a stronger mediation effect than NEP. In other words, the CNS better predicts pro-environmental outcomes.</w:t>
+        <w:t xml:space="preserve">. The personality traits of Openness and Conscientiousness were both shown to be positive predictors of environmental behavior. In both cases, the CNS had a stronger mediating effect than the NEP. In other words, the CNS better predicted pro-environmental outcomes.</w:t>
       </w:r>
       <w:r>
         <w:rPr>
@@ -1041,7 +1074,10 @@
         <w:footnoteReference w:id="14"/>
       </w:r>
       <w:r>
-        <w:t xml:space="preserve">. Finally, the CNS (plus control variables) was found to account for 35% of the variance in environmental behaviors</w:t>
+        <w:t xml:space="preserve"> </w:t>
+      </w:r>
+      <w:r>
+        <w:t xml:space="preserve">Finally, the CNS (plus control variables) accounted for 35% of the variance in environmental behaviors</w:t>
       </w:r>
       <w:r>
         <w:t xml:space="preserve">(Sparks et al. 2021)</w:t>
@@ -1066,7 +1102,7 @@
         <w:pStyle w:val="FirstParagraph"/>
       </w:pPr>
       <w:r>
-        <w:t xml:space="preserve">Cultural cognition can be thought of as a deep core belief, and therefore it is an antecedent to environmental orientations. Cultural-based views of risk and the social-psychological tendencies to protect those views likely precede the development of environment-specific cognition, attitudes, and orientations. And given the mixed evidence, is it unclear if the connection between cultural cognition and environmental behavior it is a direct or indirect relationship.</w:t>
+        <w:t xml:space="preserve">Cultural cognition can be thought of as a deep core belief; therefore, it is an antecedent to environmental orientations. Culture-based views of risk and the social-psychological tendencies to protect those views likely precede the development of environment-specific cognition, attitudes, and orientations. Given the mixed evidence, it is unclear whether the connection between cultural cognition and environmental behavior is direct or indirect.</w:t>
       </w:r>
     </w:p>
     <w:p>
@@ -1074,7 +1110,7 @@
         <w:pStyle w:val="BodyText"/>
       </w:pPr>
       <w:r>
-        <w:t xml:space="preserve">Taking the step from cultural worldviews to environmental orientations, we posit that environmental orientations contain both a cognitive, worldview element that can be measured by the New Ecological Paradigm (NEP) and an affective, emotional connection to nature, as measured by the Connectedness to Nature Scale (CNS). As noted, cultural worldviews are an antecedent to environmental orientations, and similarly, we posit that ecological worldviews are an antecedent to connectedness to nature. Finally, environmental orientations are predictive of pro-environmental behaviors.</w:t>
+        <w:t xml:space="preserve">Taking the step from cultural worldviews to environmental orientations, we suggest that environmental orientations contain both a cognitive worldview element that can be measured by the New Ecological Paradigm (NEP) and an affective emotional connection to nature, as measured by the Connectedness to Nature Scale (CNS). As noted, cultural worldviews are an antecedent to environmental orientations. Similarly, we posit that ecological worldviews are an antecedent to connectedness to nature. Finally, environmental orientations are predictive of pro-environmental behaviors.</w:t>
       </w:r>
       <w:r>
         <w:rPr>
@@ -1097,7 +1133,7 @@
         <w:t xml:space="preserve"> </w:t>
       </w:r>
       <w:r>
-        <w:t xml:space="preserve">illustrates out conceptual model connecting cognition, based on cultural and ecological worldviews; environmental orientations, including both the ecological worldview component and the affective connection to nature component; and pro-environmental behaviors.</w:t>
+        <w:t xml:space="preserve">illustrates our conceptual model connecting cognition based on cultural and ecological worldviews, environmental orientations, including both the ecological worldview component and the affective connection to nature component, and pro-environmental behaviors.</w:t>
       </w:r>
     </w:p>
     <w:tbl>
@@ -1212,7 +1248,7 @@
         </w:r>
       </w:hyperlink>
       <w:r>
-        <w:t xml:space="preserve">, where cultural worldviews influence ecological worldviews, ecological worldviews influence the connectedness to nature, and connectedness to nature influence pro-environmental behaviors. We also have direct hypotheses, where cultural and ecological worldviews are directly associated with behaviors. We expect that:</w:t>
+        <w:t xml:space="preserve">, where cultural worldviews influence ecological worldviews, ecological worldviews influence connectedness to nature, and connectedness to nature influences pro-environmental behaviors. We also have direct hypotheses, where cultural and ecological worldviews are directly associated with behaviors. We expect that:</w:t>
       </w:r>
     </w:p>
     <w:p>
@@ -1376,7 +1412,7 @@
       </w:r>
     </w:p>
     <w:bookmarkEnd w:id="22"/>
-    <w:bookmarkStart w:id="29" w:name="data-and-methods"/>
+    <w:bookmarkStart w:id="28" w:name="data-and-methods"/>
     <w:p>
       <w:pPr>
         <w:pStyle w:val="Heading1"/>
@@ -1390,22 +1426,10 @@
         <w:pStyle w:val="FirstParagraph"/>
       </w:pPr>
       <w:r>
-        <w:t xml:space="preserve">To examine the relationship between cultural cognition, environmental orientations, and behavior we draw on a sample of 501 adults living in the US purchased through Survey Sampling Inc. Overall, the sample is largely reflective of the US population in terms of demographics as 51% of respondents are women, 67% are white, and the average respondent is 44 years of age. Additionally, the average person in our sample has attended some college and reports a household income between $95,001 and 130,000. The survey was administered online in July 2017. The sample size was determined by cost considerations.</w:t>
-      </w:r>
-      <w:r>
-        <w:rPr>
-          <w:rStyle w:val="FootnoteReference"/>
-        </w:rPr>
-        <w:footnoteReference w:id="23"/>
-      </w:r>
-      <w:r>
-        <w:t xml:space="preserve"> </w:t>
-      </w:r>
-      <w:r>
-        <w:t xml:space="preserve">Our analysis was not pre-registered.</w:t>
+        <w:t xml:space="preserve">To examine the relationship between cultural cognition, environmental orientations, and behavior, we draw on a sample of 501 adults living in the US purchased through Survey Sampling Inc. Overall, the sample is largely reflective of the US population in terms of demographics, as 51% of respondents are women, 67% are white, and the average respondent is 44 years of age. Additionally, the average person in our sample had attended some college and reported a household income between $95,001 and 130,000. The survey was administered online in July 2017. The sample size was determined based on cost considerations. Our analysis was not pre-registered.</w:t>
       </w:r>
     </w:p>
-    <w:bookmarkStart w:id="28" w:name="measures"/>
+    <w:bookmarkStart w:id="27" w:name="measures"/>
     <w:p>
       <w:pPr>
         <w:pStyle w:val="Heading2"/>
@@ -1419,7 +1443,7 @@
         <w:pStyle w:val="FirstParagraph"/>
       </w:pPr>
       <w:r>
-        <w:t xml:space="preserve">Our dependent variable is a 12-item scale of self-reported pro-environmental behaviors. Questions were taken from the 2000 Gallup Earth Day Poll. Respondents were given a list of several environmental behaviors and asked, “</w:t>
+        <w:t xml:space="preserve">Our dependent variable is a 12-item scale of self-reported pro-environmental behaviors. The questions were taken from the 2000 Gallup Earth Day Poll. Respondents were given a list of several environmental behaviors and asked, “</w:t>
       </w:r>
       <w:r>
         <w:rPr>
@@ -1429,7 +1453,7 @@
         <w:t xml:space="preserve">Which of these, if any, have you, yourself, done in the past year</w:t>
       </w:r>
       <w:r>
-        <w:t xml:space="preserve">?” Possible responses included, “Yes, have done; No, have not done; No opinion.” Yes, responses were coded as a 1 and no/no opinion were coded as 0. For the purposes of analysis, we treat the behavior measures as observed and we added the number of self-reported behaviors together to produce a measure that ranges from 0 (no behaviors) to 12 (all of the behaviors).</w:t>
+        <w:t xml:space="preserve">?” Possible responses included, “Yes, have done; No, have not done; No opinion.” Yes, responses were coded as 1, and no/no opinion was coded as 0. For the purposes of analysis, we treated the behavioral measures as observed and added the number of self-reported behaviors together to produce a measure that ranged from 0 (no behaviors) to 12 (all behaviors).</w:t>
       </w:r>
       <w:r>
         <w:t xml:space="preserve"> </w:t>
@@ -1452,7 +1476,7 @@
         <w:rPr>
           <w:rStyle w:val="FootnoteReference"/>
         </w:rPr>
-        <w:footnoteReference w:id="24"/>
+        <w:footnoteReference w:id="23"/>
       </w:r>
     </w:p>
     <w:tbl>
@@ -1468,7 +1492,7 @@
       <w:tr>
         <w:tc>
           <w:tcPr/>
-          <w:bookmarkStart w:id="25" w:name="tbl-behaviors"/>
+          <w:bookmarkStart w:id="24" w:name="tbl-behaviors"/>
           <w:p>
             <w:pPr>
               <w:jc w:val="center"/>
@@ -5032,7 +5056,7 @@
               </w:tc>
             </w:tr>
           </w:tbl>
-          <w:bookmarkEnd w:id="25"/>
+          <w:bookmarkEnd w:id="24"/>
         </w:tc>
       </w:tr>
     </w:tbl>
@@ -5055,7 +5079,7 @@
         </w:r>
       </w:hyperlink>
       <w:r>
-        <w:t xml:space="preserve">, the mean number of self-reported pro-environmental behaviors was 5.4, with a standard deviation of 2.86 in the 0 to 12 scale. For public behaviors the mean was 1.8, with a standard deviation of 1.92, and the mean number of self-reported private behaviors was 3.6, with a standard deviation of 1.58. Overall, respondents reported far more private than public behaviors. In terms of the behavior themselves, recycling had the highest mean at 0.79, which indicates that 79% of the respondents reported that they recycle, followed closely by reducing household energy use at 0.78; buying a product because it was better for the environment had the lowest mean among private behaviors at 0.62. Among public behaviors, voting for or working for a candidate because of their environmental positions had the highest mean at 0.4, followed by signing a petition supporting environmental protection at 0.36; contacting a business to complain about environmentally harmful products/policies had the lowest mean among public behaviors at 0.16.</w:t>
+        <w:t xml:space="preserve">, the mean number of self-reported pro-environmental behaviors was 5.4, with a standard deviation of 2.86 in the 0 to 12 scale. For public behaviors the mean was 1.8, with a standard deviation of 1.92, and the mean number of self-reported private behaviors was 3.6, with a standard deviation of 1.58. Overall, respondents reported far more private than public behaviors. In terms of the behavior themselves, recycling had the highest mean at 0.79, which indicates that 79% of the respondents reported that they recycle, followed closely by reducing household energy use at 0.78. Buying a product because it was better for the environment had the lowest mean among private behaviors at 0.62. Among public behaviors, voting for or working for a candidate because of their environmental positions had the highest mean at 0.4, followed by signing a petition supporting environmental protection at 0.36. Contacting a business to complain about environmentally harmful products/policies had the lowest mean among public behaviors at 0.16.</w:t>
       </w:r>
     </w:p>
     <w:p>
@@ -5063,7 +5087,7 @@
         <w:pStyle w:val="BodyText"/>
       </w:pPr>
       <w:r>
-        <w:t xml:space="preserve">Our independent variables are composite measures of cultural worldviews, ecological worldviews (New Ecological Paradigm), and the Connectedness to Nature Scale. For cultural cognition, we rely on the short form of the cultural cognition survey questions which includes three questions for each of the four cultural worldviews</w:t>
+        <w:t xml:space="preserve">Our independent variables are composite measures of cultural worldviews, ecological worldviews (New Ecological Paradigm), and the Connectedness to Nature Scale. For cultural cognition, we rely on the short form of the cultural cognition survey questions, which include three questions for each of the four cultural worldviews</w:t>
       </w:r>
       <w:r>
         <w:t xml:space="preserve"> </w:t>
@@ -5072,7 +5096,7 @@
         <w:t xml:space="preserve">(see Kahan 2012)</w:t>
       </w:r>
       <w:r>
-        <w:t xml:space="preserve">. Respondents were asked their agreement on a 1 (strongly disagree) to 4 (strongly agree) scale with three statements for each of cultural worldviews. To measure the New Ecological Paradigm (NEP) we used agreement with three statements on a 1 to 5 scale (1 - strongly disagree, 3 - neutral, 5 - strongly agree). Finally, for the Connectedness to Nature Scale (CNS) using respondent agreement on a 1 to 5 scale (1 - strongly disagree, 3 - neutral, 5 - strongly agree) with three statements. For both the NEP and the CNS, a higher value indicates a stronger orientation towards the environment.</w:t>
+        <w:t xml:space="preserve">. Respondents were asked to indicate their agreement on a 1 (strongly disagree) to 4 (strongly agree) scale with three statements for each cultural worldview. To measure the New Ecological Paradigm (NEP) we used agreement with three statements on a 1 to 5 scale (1 - strongly disagree, 3 - neutral, 5 - strongly agree). Finally, for the Connectedness to Nature Scale (CNS), respondents were asked to indicate their agreement on a 1 to 5 scale (1 - strongly disagree, 3 - neutral, 5 - strongly agree) with three statements. For both the NEP and CNS, a higher value indicates a stronger orientation towards the environment.</w:t>
       </w:r>
     </w:p>
     <w:p>
@@ -5116,7 +5140,7 @@
         </w:r>
       </w:hyperlink>
       <w:r>
-        <w:t xml:space="preserve">, each of the constructs show sufficient reliability (α and CR &gt;0.70) except for the communitarianism scale. However, CR values between 0.60 and 0.70 are acceptable for exploratory analysis</w:t>
+        <w:t xml:space="preserve">, each construct showed sufficient reliability (α and CR &gt;0.70), except for the communitarianism scale. However, CR values between 0.60 and 0.70 are acceptable for exploratory analysis</w:t>
       </w:r>
       <w:r>
         <w:t xml:space="preserve"> </w:t>
@@ -5141,7 +5165,7 @@
       <w:tr>
         <w:tc>
           <w:tcPr/>
-          <w:bookmarkStart w:id="26" w:name="tbl-measurement"/>
+          <w:bookmarkStart w:id="25" w:name="tbl-measurement"/>
           <w:p>
             <w:pPr>
               <w:jc w:val="center"/>
@@ -10395,7 +10419,7 @@
               </w:tc>
             </w:tr>
           </w:tbl>
-          <w:bookmarkEnd w:id="26"/>
+          <w:bookmarkEnd w:id="25"/>
         </w:tc>
       </w:tr>
     </w:tbl>
@@ -10404,7 +10428,7 @@
         <w:pStyle w:val="BodyText"/>
       </w:pPr>
       <w:r>
-        <w:t xml:space="preserve">On the cultural worldview measures, we combined the scales to create dummy variables for hierarchical-individualists and egalitarian-communitarians. Respondents who scored at or above the median for both scales were coded as 1, all others were coded as 0</w:t>
+        <w:t xml:space="preserve">For the cultural worldview measures, we combined the scales to create dummy variables for hierarchical individualists and egalitarian communitarians. Respondents who scored at or above the median for both scales were coded as 1, and all others were coded as 0</w:t>
       </w:r>
       <w:r>
         <w:t xml:space="preserve"> </w:t>
@@ -10413,7 +10437,7 @@
         <w:t xml:space="preserve">(similar to Kahan et al. 2012)</w:t>
       </w:r>
       <w:r>
-        <w:t xml:space="preserve">. Overall, 213 respondents (42.5%) were classified as hierarchical-individualists, and 176 respondents (35.1%) were classified as egalitarian-communitarians.</w:t>
+        <w:t xml:space="preserve">. Overall, 213 respondents (42.5%) were classified as hierarchical individualists and 176 respondents (35.1%) as egalitarian communitarians.</w:t>
       </w:r>
     </w:p>
     <w:p>
@@ -10454,7 +10478,7 @@
         <w:t xml:space="preserve">(Rosseel 2012)</w:t>
       </w:r>
       <w:r>
-        <w:t xml:space="preserve">. The dependent variable, self-reported pro-environmental behaviors, is an observed variable and the cultural cognition worldviews, the CNS, and the NEP scale are latent constructs using the measures in</w:t>
+        <w:t xml:space="preserve">. The dependent variable, self-reported pro-environmental behaviors, is an observed variable, and the cultural cognition worldviews, the CNS, and the NEP scale are latent constructs using the measures in</w:t>
       </w:r>
       <w:r>
         <w:t xml:space="preserve"> </w:t>
@@ -10468,18 +10492,18 @@
         </w:r>
       </w:hyperlink>
       <w:r>
-        <w:t xml:space="preserve">. In addition, we examine the mediation effects of environmental orientation by examining the direct, indirect, and total effects of the cultural worldviews on pro-environmental behavior.</w:t>
+        <w:t xml:space="preserve">. In addition, we examine the mediation effects of environmental orientation by examining the direct, indirect, and total effects of cultural worldviews on pro-environmental behavior.</w:t>
       </w:r>
       <w:r>
         <w:rPr>
           <w:rStyle w:val="FootnoteReference"/>
         </w:rPr>
-        <w:footnoteReference w:id="27"/>
+        <w:footnoteReference w:id="26"/>
       </w:r>
     </w:p>
+    <w:bookmarkEnd w:id="27"/>
     <w:bookmarkEnd w:id="28"/>
-    <w:bookmarkEnd w:id="29"/>
-    <w:bookmarkStart w:id="36" w:name="results"/>
+    <w:bookmarkStart w:id="35" w:name="results"/>
     <w:p>
       <w:pPr>
         <w:pStyle w:val="Heading1"/>
@@ -10493,7 +10517,7 @@
         <w:pStyle w:val="FirstParagraph"/>
       </w:pPr>
       <w:r>
-        <w:t xml:space="preserve">The results for the SEM are shown in</w:t>
+        <w:t xml:space="preserve">The SEM results are shown in</w:t>
       </w:r>
       <w:r>
         <w:t xml:space="preserve"> </w:t>
@@ -10507,7 +10531,7 @@
         </w:r>
       </w:hyperlink>
       <w:r>
-        <w:t xml:space="preserve">. For clarity we only include the structural model and only the paths that were statistically significant at p&lt;0.05.</w:t>
+        <w:t xml:space="preserve">. For clarity, we only include the structural model and only the paths that were statistically significant at p&lt;0.05.</w:t>
       </w:r>
     </w:p>
     <w:tbl>
@@ -10523,7 +10547,7 @@
       <w:tr>
         <w:tc>
           <w:tcPr/>
-          <w:bookmarkStart w:id="33" w:name="fig-structural"/>
+          <w:bookmarkStart w:id="32" w:name="fig-structural"/>
           <w:p>
             <w:pPr>
               <w:jc w:val="center"/>
@@ -10546,18 +10570,18 @@
                 <wp:inline>
                   <wp:extent cx="5334000" cy="4445000"/>
                   <wp:effectExtent b="0" l="0" r="0" t="0"/>
-                  <wp:docPr descr="" title="" id="31" name="Picture"/>
+                  <wp:docPr descr="" title="" id="30" name="Picture"/>
                   <a:graphic>
                     <a:graphicData uri="http://schemas.openxmlformats.org/drawingml/2006/picture">
                       <pic:pic>
                         <pic:nvPicPr>
-                          <pic:cNvPr descr="cc-behave_files/figure-docx/unnamed-chunk-1-1.png" id="32" name="Picture"/>
+                          <pic:cNvPr descr="cc-behave_files/figure-docx/unnamed-chunk-1-1.png" id="31" name="Picture"/>
                           <pic:cNvPicPr>
                             <a:picLocks noChangeArrowheads="1" noChangeAspect="1"/>
                           </pic:cNvPicPr>
                         </pic:nvPicPr>
                         <pic:blipFill>
-                          <a:blip r:embed="rId30"/>
+                          <a:blip r:embed="rId29"/>
                           <a:stretch>
                             <a:fillRect/>
                           </a:stretch>
@@ -10584,7 +10608,7 @@
               </w:drawing>
             </w:r>
           </w:p>
-          <w:bookmarkEnd w:id="33"/>
+          <w:bookmarkEnd w:id="32"/>
         </w:tc>
       </w:tr>
     </w:tbl>
@@ -10593,7 +10617,7 @@
         <w:pStyle w:val="BodyText"/>
       </w:pPr>
       <w:r>
-        <w:t xml:space="preserve">As can be seen in</w:t>
+        <w:t xml:space="preserve">As shown in</w:t>
       </w:r>
       <w:r>
         <w:t xml:space="preserve"> </w:t>
@@ -10607,7 +10631,7 @@
         </w:r>
       </w:hyperlink>
       <w:r>
-        <w:t xml:space="preserve">, as expected, hierarchical-individualists were negatively associated with the ecological worldviews (NEP). This is as expected because a positive value indicates a more environment-centric worldviews. Also as expected, egalitarian-communitarians were positively associated with the NEP. Additionally, the cognitive element of environmental orientations, the NEP, was positively associated with the affective element, the CNS, as expected. Reharding pro-envrionmental behaviors, as expected both elements of environmental orientations were positively associated with an increase in the number behaviors; however, there was no direct relationship to cultural worldviews and behavior. Finally, egalitarian-communitarians were more likely to feel connected to nature, therefore, they had the strongest environmental orientation as both the cognitive and affective elements were significant.</w:t>
+        <w:t xml:space="preserve">, as expected, hierarchical individualists were negatively associated with ecological worldviews (NEP). This was expected because a positive value indicates a more environmentally centric worldview. Also as expected, egalitarian-communitarians were positively associated with the NEP. Additionally, the cognitive element of environmental orientations, the NEP, was positively associated with the affective element, the CNS, as expected. Regarding pro-environmental behaviors, as expected, both elements of environmental orientation were positively associated with an increase in the number of behaviors; however, there was no direct relationship between cultural worldviews and behavior. Finally, egalitarian-communitarians were more likely to feel connected to nature; therefore, they had the strongest environmental orientation, as both the cognitive and affective elements were significant.</w:t>
       </w:r>
     </w:p>
     <w:p>
@@ -10615,7 +10639,7 @@
         <w:pStyle w:val="BodyText"/>
       </w:pPr>
       <w:r>
-        <w:t xml:space="preserve">The path coefficients are standardized, which means that they equal the expected change in the standard deviation (sd) of the outcome variables for each standard deviation of the predictor, keeping all other variables constant. For example, the path coefficient from CNS to behaviors is 0.404, so holding the other variables constant, a 1-sd increase in the CNS scale is associated with a 0.404-sd increase in the number of behaviors. In terms of the number of actual predicted behaviors, as shown in</w:t>
+        <w:t xml:space="preserve">The path coefficients are standardized, which means that they equal the expected change in the standard deviation (sd) of the outcome variables for each standard deviation of the predictor, keeping all other variables constant. For example, the path coefficient from CNS to behaviors is 0.404; therefore, holding the other variables constant, a 1-sd increase in the CNS scale is associated with a 0.404-sd increase in the number of behaviors. In terms of the number of actual predicted behaviors, as shown in</w:t>
       </w:r>
       <w:r>
         <w:t xml:space="preserve"> </w:t>
@@ -10629,7 +10653,7 @@
         </w:r>
       </w:hyperlink>
       <w:r>
-        <w:t xml:space="preserve">, the sd of behaviors is 2.86 and 0.404 x 2.86 equals 1.155 predicted additional behaviors for each 1-sd increase in the CNS.</w:t>
+        <w:t xml:space="preserve">, the sd of behaviors is 2.86, and 0.404 × 2.86 equals 1.155 predicted additional behaviors for each 1-sd increase in the CNS.</w:t>
       </w:r>
     </w:p>
     <w:p>
@@ -10637,7 +10661,7 @@
         <w:pStyle w:val="BodyText"/>
       </w:pPr>
       <w:r>
-        <w:t xml:space="preserve">Standardized path coefficients allow for a comparison of strength of the various relationships. As shown, the strongest relationship is between the two environmental orientation measures, with the NEP to CNS path = 0.425. In terms of the relationship to behaviors, the CNS path is the strongest at 0.404 followed by the NEP to behavior path at 0.240. No other paths to behaviors is significant. For cultural worldviews to environmental orientations, hierarchal individualists have the strongest (negative) relationship, at -0.392, with ecological worldviews. Egalitarian communitarians have a stronger relationship to ecological worldviews at 0.231 than connectedness to nature at 0.188, but are significantly associated with both.</w:t>
+        <w:t xml:space="preserve">Standardized path coefficients allow for a comparison of the strengths of the various relationships. As shown, the strongest relationship is between the two environmental orientation measures, with the NEP to CNS path = 0.425. In terms of the relationship to behaviors, the CNS path was the strongest at 0.404, followed by the NEP to behavior path at 0.240. No other paths to behaviors were significant. For cultural worldviews to environmental orientations, hierarchal individualists have the strongest (negative) relationship, at -0.392, with ecological worldviews. Egalitarian communitarians has a stronger relationship with ecological worldviews (0.231) than with connectedness to nature (0.188), but is significantly associated with both.</w:t>
       </w:r>
     </w:p>
     <w:p>
@@ -10659,7 +10683,10 @@
         </w:r>
       </w:hyperlink>
       <w:r>
-        <w:t xml:space="preserve">, and include the Root Mean Square Error of Approximation (RMSEA), the Comparative Fit Index (CFI), the Tucker-Lewis Index (TFI), the Root Mean Square Error of Approximation (RMSEA) and its confidence intervals, the Standardized Root Mean Square Residual (SRMR), and the AIC and BIC. Overall, the statistics indicate a reasonable fit for the model</w:t>
+        <w:t xml:space="preserve"> </w:t>
+      </w:r>
+      <w:r>
+        <w:t xml:space="preserve">and include the Root Mean Square Error of Approximation (RMSEA), Comparative Fit Index (CFI), Tucker-Lewis Index (TFI), Root Mean Square Error of Approximation (RMSEA) and its confidence intervals, Standardized Root Mean Square Residual (SRMR), and AIC and BIC. Overall, the statistics indicate a reasonable fit for the model</w:t>
       </w:r>
       <w:r>
         <w:t xml:space="preserve"> </w:t>
@@ -10684,7 +10711,7 @@
       <w:tr>
         <w:tc>
           <w:tcPr/>
-          <w:bookmarkStart w:id="34" w:name="tbl-fit-full"/>
+          <w:bookmarkStart w:id="33" w:name="tbl-fit-full"/>
           <w:p>
             <w:pPr>
               <w:jc w:val="center"/>
@@ -11868,7 +11895,7 @@
               </w:tc>
             </w:tr>
           </w:tbl>
-          <w:bookmarkEnd w:id="34"/>
+          <w:bookmarkEnd w:id="33"/>
         </w:tc>
       </w:tr>
     </w:tbl>
@@ -11877,7 +11904,7 @@
         <w:pStyle w:val="BodyText"/>
       </w:pPr>
       <w:r>
-        <w:t xml:space="preserve">Next we examine the direct, indirect, and total effects of cultural worldviews on behaviors. Those results are shown in</w:t>
+        <w:t xml:space="preserve">Next, we examined the direct, indirect, and total effects of cultural worldviews on behavior. Those results are shown in</w:t>
       </w:r>
       <w:r>
         <w:t xml:space="preserve"> </w:t>
@@ -11907,7 +11934,7 @@
       <w:tr>
         <w:tc>
           <w:tcPr/>
-          <w:bookmarkStart w:id="35" w:name="tbl-serial-effects"/>
+          <w:bookmarkStart w:id="34" w:name="tbl-serial-effects"/>
           <w:p>
             <w:pPr>
               <w:jc w:val="center"/>
@@ -12821,7 +12848,7 @@
               </w:tc>
             </w:tr>
           </w:tbl>
-          <w:bookmarkEnd w:id="35"/>
+          <w:bookmarkEnd w:id="34"/>
         </w:tc>
       </w:tr>
     </w:tbl>
@@ -12830,7 +12857,7 @@
         <w:pStyle w:val="BodyText"/>
       </w:pPr>
       <w:r>
-        <w:t xml:space="preserve">For hierarchical individualists there was a total effect on behaviors of -0.121 and for egalitarian communitarians it was 0.199. However, as shown in</w:t>
+        <w:t xml:space="preserve">For hierarchical individualists, the total effect on behaviors was -0.121, and for egalitarian communitarians, it was 0.199. However, as shown in</w:t>
       </w:r>
       <w:r>
         <w:t xml:space="preserve"> </w:t>
@@ -12861,7 +12888,7 @@
         </w:r>
       </w:hyperlink>
       <w:r>
-        <w:t xml:space="preserve">, there is no direct relationship from cultural worldviews to behaviors, therefore the effects are strictly a result of indirect effects as environmental orientations appear to mediate the relationship between cultural worldviews and behaviors.</w:t>
+        <w:t xml:space="preserve">, there is no direct relationship between cultural worldviews and behaviors; therefore, the effects are strictly a result of indirect effects, as environmental orientations appear to mediate the relationship between cultural worldviews and behaviors.</w:t>
       </w:r>
     </w:p>
     <w:p>
@@ -12869,11 +12896,11 @@
         <w:pStyle w:val="BodyText"/>
       </w:pPr>
       <w:r>
-        <w:t xml:space="preserve">The serial effect includes the paths of the cultural worldviews to the NEP, NEP to CNS, and CNS to behaviors. So, for example, for hierarchical individualists the serial effect is calculated by −0.392 × 0.425 × 0.404 = −0.067. The total indirect effect captures the paths from cultural worldviews to NEP, NEP to behaviors, cultural worldviews to CNS, and the serial effect. For hierarchical individualists that is (−0.392×0.240) + (0.010×0.404) + (−0.067) = −0.094 + 0.004 − 0.067 = −0.157. Finally, the total effect is simply the direct effect plus the total indirect effect.</w:t>
+        <w:t xml:space="preserve">The serial effect includes the paths of cultural worldviews to the NEP, NEP to CNS, and CNS to behaviors. For example, for hierarchical individualists, the serial effect is calculated as −0.392 × 0.425 × 0.404 = −0.067. The total indirect effect captures the paths from cultural worldviews to NEP, NEP to behavior, cultural worldviews to CNS, and the serial effect. For hierarchical individualists that is (−0.392×0.240) + (0.010×0.404) + (−0.067) = −0.094 + 0.004 − 0.067 = −0.157. Finally, the total effect is simply the direct effect plus the total indirect effect.</w:t>
       </w:r>
     </w:p>
-    <w:bookmarkEnd w:id="36"/>
-    <w:bookmarkStart w:id="37" w:name="discussion"/>
+    <w:bookmarkEnd w:id="35"/>
+    <w:bookmarkStart w:id="36" w:name="discussion"/>
     <w:p>
       <w:pPr>
         <w:pStyle w:val="Heading1"/>
@@ -12887,7 +12914,7 @@
         <w:pStyle w:val="FirstParagraph"/>
       </w:pPr>
       <w:r>
-        <w:t xml:space="preserve">Scholars have noted a gap between values and beliefs about the environment and pro-environmental behavior. In particular, the cultural worldviews derived from cultural cognition, specifically egalitarianism and communitarianism, have been shown to inform views about several environment issues as well as overall attitude toward the environment. However, little research has found a connection between cultural worldviews and environmental behavior</w:t>
+        <w:t xml:space="preserve">Scholars have noted a gap between values and beliefs about the environment and pro-environmental behavior. In particular, cultural worldviews derived from cultural cognition, specifically egalitarianism and communitarianism, have been shown to inform views on several environmental issues as well as overall attitudes toward the environment. However, little research has found a connection between cultural worldviews and environmental behavior</w:t>
       </w:r>
       <w:r>
         <w:t xml:space="preserve"> </w:t>
@@ -12896,7 +12923,7 @@
         <w:t xml:space="preserve">(but see Markle 2019)</w:t>
       </w:r>
       <w:r>
-        <w:t xml:space="preserve">. In this paper, we developed and tested a conceptual model, based on the existing VBN and ACF framworks, where cultural worldviews influence environmental orientations, and environmental orientations influence behaviors. Additionally, our contribution notes that cultural worldviews and ecological worldviews are cognitive features of belief systems that provide both a basis of values and beliefs as well as a series of psychological mechanisms that ensure that beliefs and attitudes are consistent with the underlying worldviews. In turn, these cognitive features of belief systems influence the affective element of environmental orientations, which is the emotional connection to nature. Finally, the affective element of environmental orientations is what is most strongly associated with pro-environmental behaviors.</w:t>
+        <w:t xml:space="preserve">. In this paper, we developed and tested a conceptual model based on the existing VBN and ACF frameworks, in which cultural worldviews influence environmental orientations, and environmental orientations influence behaviors. Additionally, our contribution notes that cultural and ecological worldviews are cognitive features of belief systems that provide both a basis of values and beliefs as well as a series of psychological mechanisms that ensure that beliefs and attitudes are consistent with the underlying worldviews. In turn, these cognitive features of belief systems influence the affective element of environmental orientations, which is the emotional connection to nature. Finally, the affective element of environmental orientation is most strongly associated with pro-environmental behavior.</w:t>
       </w:r>
     </w:p>
     <w:p>
@@ -12904,7 +12931,7 @@
         <w:pStyle w:val="BodyText"/>
       </w:pPr>
       <w:r>
-        <w:t xml:space="preserve">Based on our conceptual model, we posited that egalitarian communitarians would be positively associated with environmental orientations and environmental behavior, and hierarchical individualists would be negatively associated with environmental orientations and environmental behavior. Additionally, we expected that the cognitive element of environmental orientations would be associated with the affective element, and that both elements of environmental orientation would be associated with increased self-reported pro-environmental behaviors. Overall, we found mixed results for our hypotheses. As expected, egalitarian communitarians were associated with both the CNS and NEP; however, they were not directly associated with behaviors. In addition, hierarchical individualists were less likely to have an ecological worlviews, but they were no more or less likely to feel connected to nature than the other cultural worldviews. Finally, both elements of environmental orientations were associated with more pro-environmental behaviors, and, based on the standardized coefficients, the affective element (CNS) had a stronger relationship than the cognition element (NEP).</w:t>
+        <w:t xml:space="preserve">Based on our conceptual model, we posited that egalitarian communitarians would be positively associated with environmental orientations and environmental behavior, and hierarchical individualists would be negatively associated with environmental orientations and environmental behavior. Additionally, we expected that the cognitive element of environmental orientation would be associated with the affective element and that both elements of environmental orientation would be associated with increased self-reported pro-environmental behaviors. Overall, we found mixed results for our hypotheses. As expected, egalitarian communitarians were associated with both the CNS and NEP; however, they were not directly associated with behavior. In addition, hierarchical individualists were less likely to have an ecological worldview, but they were no more or less likely to feel connected to nature than those with other cultural worldviews. Finally, both elements of environmental orientation were associated with more pro-environmental behaviors, and based on the standardized coefficients, the affective element (CNS) had a stronger relationship than the cognitive element (NEP).</w:t>
       </w:r>
     </w:p>
     <w:p>
@@ -12912,7 +12939,7 @@
         <w:pStyle w:val="BodyText"/>
       </w:pPr>
       <w:r>
-        <w:t xml:space="preserve">Given the uncertainty about the relationship between cultural worldviews and pro-environmental behaviors, we also did a mediation analysis to examine if environmental orientations mediate the relationship between cultural worldviews and behaviors. If so, cultural worldviews would still influence behavior, but only indirectly. We found that both the cognitive and affective elements of environmental orientations mediated the relationship between cultural worldviews and environmental behaviors. This means that the effect of cultural worldviews on pro-environmental behaviors is based solely on their influence in environmental orientations. Along with the results of the structural equation modeling, this helps us understand cultural cognition as an antecedent of environmental orientation and fill some of the attitude-behavior gap.</w:t>
+        <w:t xml:space="preserve">Given the uncertainty about the relationship between cultural worldviews and pro-environmental behaviors, we also conducted a mediation analysis to examine whether environmental orientations mediate the relationship between cultural worldviews and behaviors. If so, cultural worldviews would still influence behavior but only indirectly. We found that both the cognitive and affective elements of environmental orientations mediated the relationship between cultural worldviews and environmental behaviors. This means that the effect of cultural worldviews on pro-environmental behaviors is based solely on their influence on environmental orientations. Along with the results of the structural equation modeling, this helps us understand cultural cognition as an antecedent of environmental orientation and fill some of the attitude-behavior gap.</w:t>
       </w:r>
     </w:p>
     <w:p>
@@ -12920,7 +12947,7 @@
         <w:pStyle w:val="BodyText"/>
       </w:pPr>
       <w:r>
-        <w:t xml:space="preserve">We also found that the Connectedness to Nature Scale (CNS) had more predictive power regarding environmental behaviors than the NEP based on the standardized path coefficients shown in</w:t>
+        <w:t xml:space="preserve">We also found that the Connectedness to Nature Scale (CNS) had more predictive power regarding environmental behaviors than the NEP, based on the standardized path coefficients shown in</w:t>
       </w:r>
       <w:r>
         <w:t xml:space="preserve"> </w:t>
@@ -12943,7 +12970,7 @@
         <w:t xml:space="preserve">(e.g., Sparks et al. 2021)</w:t>
       </w:r>
       <w:r>
-        <w:t xml:space="preserve">. Additionally, it seems that the CNS and NEP are measure two distinct concepts that can be grouped under the umbrella of environmental orientation, where the NEP is explicitly a measure of environmental-attitude while CNS is a measure of emotional connection to nature. Overall, the affective element of environmental orientations is more proximate to behaviors than the cognitive element. Along similar lines, a recent study found that harnessing the right mix of emotions is a powerful motivator of climate action</w:t>
+        <w:t xml:space="preserve">. Additionally, the CNS and NEP measure two distinct concepts that can be grouped under the umbrella of environmental orientation, where the NEP is explicitly a measure of environmental attitude, while the CNS is a measure of emotional connection to nature. Overall, the affective element of environmental orientations is more proximate to behaviors than the cognitive element. Similarly, a recent study found that harnessing the right mix of emotions is a powerful motivator of climate action</w:t>
       </w:r>
       <w:r>
         <w:t xml:space="preserve"> </w:t>
@@ -12960,7 +12987,7 @@
         <w:pStyle w:val="BodyText"/>
       </w:pPr>
       <w:r>
-        <w:t xml:space="preserve">Another reason that the affective element of environmental orientations, the CNS, displays more power than the cognitive NEP to influence behavior is that there has been a slow decline in environmental concern as measured by the NEP</w:t>
+        <w:t xml:space="preserve">Another reason that the affective element of environmental orientation, the CNS, displays more power than the cognitive NEP to influence behavior is that there has been a slow decline in environmental concern as measured by the NEP</w:t>
       </w:r>
       <w:r>
         <w:t xml:space="preserve"> </w:t>
@@ -12969,7 +12996,7 @@
         <w:t xml:space="preserve">(Lou et al. 2022)</w:t>
       </w:r>
       <w:r>
-        <w:t xml:space="preserve">. The downtrend of the NEP was shown through meta-analysis; however, there was no indication of why this may be happening. We are not aware of a similar study tracking CNS over time, but that may prove a fruitful avenue for further study. If it is only the NEP that is declining over time, that may indicate that the measurement instrument is becoming outdated, potentially because of shifts over time making the distinction between the dominant social paradigm and the new ecological paradigm less apt. For example, many see technological innovation as the key to unlocking a new green economy, rather than destroying the earth. Relatedly, perhaps the language used in the NEP has just become outmoded and out of line with how environmentalists currently would express environmental attitude</w:t>
+        <w:t xml:space="preserve">. The downtrend of the NEP was shown through meta-analysis; however, there was no indication of why this may be happening. We are not aware of a similar study tracking CNS over time, but that may prove to be a fruitful avenue for further study. If only the NEP is declining over time, that may indicate that the measurement instrument is becoming outdated, potentially because of shifts over time making the distinction between the dominant social paradigm and the new ecological paradigm less apt. For example, many see technological innovation as the key to unlocking a new green economy rather than destroying the earth. Relatedly, perhaps the language used in the NEP has just become outmoded and out of line with how environmentalists currently would express environmental attitude</w:t>
       </w:r>
       <w:r>
         <w:t xml:space="preserve"> </w:t>
@@ -12986,11 +13013,11 @@
         <w:pStyle w:val="BodyText"/>
       </w:pPr>
       <w:r>
-        <w:t xml:space="preserve">There are a few limitations with this paper. First, we have a relatively small sample size with 501. While we have no reason to think that a larger sample size would substanively change the results, the results should be replicated with more respondents. Additionally, our data is cross-section, and future research should measure the nature of the relationships between cultural cognition, environmental orientations, and environmental behaviors over-time using panel data. Panel data could explore the strength and consistency of the relationships over time. Finally, causality is difficult to determine using SEM on cross-sectional data. While we argue that there are theorectical and empirical reasons to see cognition preceding affective elements of belief systems, we recognize that the statistical associations we found does not constitute definitive evidence of causality. Therefore, we have tried to be careful in our language describing our findings.</w:t>
+        <w:t xml:space="preserve">There are a few limitations with this paper. First, the sample size was relatively small (n = 501). While we have no reason to think that a larger sample size would substantively change the results, the results should be replicated with more respondents. Additionally, our data are cross-sectional, and future research should measure the nature of the relationships between cultural cognition, environmental orientation, and environmental behavior over time using panel data. Panel data could explore the strength and consistency of the relationships over time. Finally, causality is difficult to determine using SEM with cross-sectional data. While we argue that there are theoretical and empirical reasons to see cognition preceding the affective elements of belief systems, we recognize that the statistical associations we found do not constitute definitive evidence of causality. Therefore, we have been careful in our language when describing our findings.</w:t>
       </w:r>
     </w:p>
-    <w:bookmarkEnd w:id="37"/>
-    <w:bookmarkStart w:id="38" w:name="conclusion"/>
+    <w:bookmarkEnd w:id="36"/>
+    <w:bookmarkStart w:id="37" w:name="conclusion"/>
     <w:p>
       <w:pPr>
         <w:pStyle w:val="Heading1"/>
@@ -13004,7 +13031,7 @@
         <w:pStyle w:val="FirstParagraph"/>
       </w:pPr>
       <w:r>
-        <w:t xml:space="preserve">Achieving environmentally sustainable outcomes require a significant engagement of pro-environmental behavior across all segements of society. While a large body of research exists that examines pro-environmental behaviors, some gaps remain. In this paper, we developed a conceptual model that draws a distinction between cognitive and affective elements of belief systems, and tested hypotheses based on that approach. We argue that combining cultural cognition and environmental orientation should improve our understanding of the drivers of environmentally protective behaviors</w:t>
+        <w:t xml:space="preserve">Achieving environmentally sustainable outcomes requires significant engagement in pro-environmental behavior across all segments of society. While a large body of research exists that examines pro-environmental behaviors, some gaps remain. In this paper, we developed a conceptual model that draws a distinction between the cognitive and affective elements of belief systems and tested hypotheses based on that approach. We argue that combining cultural cognition and environmental orientation should improve our understanding of the drivers of environmentally protective behaviors</w:t>
       </w:r>
     </w:p>
     <w:p>
@@ -13021,7 +13048,7 @@
         <w:t xml:space="preserve">(e.g., Kahan et al. 2012)</w:t>
       </w:r>
       <w:r>
-        <w:t xml:space="preserve">, it was something of a puzzle as to why it only weakly correlates to behavior that protects the environment – an action that can be seen as a way to reduce environmental risk to the individual. The evidence we presented in this paper suggests that environmental orientation – whether attitude (NEP) or emotional connection (CNS) – is an important link in this relationship. Additionally, we presented evidence that cultural worldviews are best thought of as indirect predictors of pro-environmental behavior. The relationship was mediated by environmental orientations as measured by both the NEP and the CNS. Further, by explaining behavior with a mediation model we could close some of the so-called attitude-behavior gap. When cultural cognition and environmental orientation are aligned, people are more likely to engage in environmentally protective behavior.</w:t>
+        <w:t xml:space="preserve">, it was something of a puzzle as to why it only weakly correlates to behavior that protects the environment – an action that can be seen as a way to reduce environmental risk to the individual. The evidence presented in this study suggests that environmental orientation, whether attitude (NEP) or emotional connection (CNS), is an important link in this relationship. Additionally, we presented evidence that cultural worldviews are best thought of as indirect predictors of pro-environmental behavior. This relationship was mediated by environmental orientation, as measured by both the NEP and CNS. Furthermore, by explaining behavior with a mediation model, we could close some of the so-called attitude-behavior gap. When cultural cognition and environmental orientation are aligned, people are more likely to engage in environmentally protective behaviors.</w:t>
       </w:r>
     </w:p>
     <w:p>
@@ -13029,7 +13056,7 @@
         <w:pStyle w:val="BodyText"/>
       </w:pPr>
       <w:r>
-        <w:t xml:space="preserve">Another implication of this study is further evidence that CNS is a stronger predictor of behavior than NEP. This may be useful for researchers trying to decide which measure of pro-environmental orientation to include in their questionnaire. We would like to see further testing of this finding in studies in other contexts and through meta-analytic techniques.</w:t>
+        <w:t xml:space="preserve">Another implication of this study is further evidence that CNS is a stronger predictor of behavior than NEP. This may be useful for researchers trying to decide which measures of pro-environmental orientation to include in their questionnaires. We would like to see further testing of this finding in studies in other contexts and through meta-analytic techniques.</w:t>
       </w:r>
     </w:p>
     <w:p>
@@ -13037,8 +13064,8 @@
         <w:br w:type="page"/>
       </w:r>
     </w:p>
-    <w:bookmarkEnd w:id="38"/>
-    <w:bookmarkStart w:id="102" w:name="references"/>
+    <w:bookmarkEnd w:id="37"/>
+    <w:bookmarkStart w:id="101" w:name="references"/>
     <w:p>
       <w:pPr>
         <w:pStyle w:val="Heading1"/>
@@ -13047,8 +13074,8 @@
         <w:t xml:space="preserve">References</w:t>
       </w:r>
     </w:p>
-    <w:bookmarkStart w:id="101" w:name="refs"/>
-    <w:bookmarkStart w:id="39" w:name="ref-ballewSystemsThinkingPathway2019"/>
+    <w:bookmarkStart w:id="100" w:name="refs"/>
+    <w:bookmarkStart w:id="38" w:name="ref-ballewSystemsThinkingPathway2019"/>
     <w:p>
       <w:pPr>
         <w:pStyle w:val="Bibliography"/>
@@ -13133,8 +13160,8 @@
         <w:t xml:space="preserve">.</w:t>
       </w:r>
     </w:p>
-    <w:bookmarkEnd w:id="39"/>
-    <w:bookmarkStart w:id="40" w:name="X02052c77ab6a183d9d4a564d1f5e6683aebb50c"/>
+    <w:bookmarkEnd w:id="38"/>
+    <w:bookmarkStart w:id="39" w:name="X02052c77ab6a183d9d4a564d1f5e6683aebb50c"/>
     <w:p>
       <w:pPr>
         <w:pStyle w:val="Bibliography"/>
@@ -13228,8 +13255,8 @@
         <w:t xml:space="preserve">65: 57–67.</w:t>
       </w:r>
     </w:p>
-    <w:bookmarkEnd w:id="40"/>
-    <w:bookmarkStart w:id="41" w:name="ref-brickUnearthingGreenPersonality2016"/>
+    <w:bookmarkEnd w:id="39"/>
+    <w:bookmarkStart w:id="40" w:name="ref-brickUnearthingGreenPersonality2016"/>
     <w:p>
       <w:pPr>
         <w:pStyle w:val="Bibliography"/>
@@ -13290,8 +13317,8 @@
         <w:t xml:space="preserve">48(5): 635–58.</w:t>
       </w:r>
     </w:p>
-    <w:bookmarkEnd w:id="41"/>
-    <w:bookmarkStart w:id="42" w:name="ref-canlasMoreTwentyYears2022"/>
+    <w:bookmarkEnd w:id="40"/>
+    <w:bookmarkStart w:id="41" w:name="ref-canlasMoreTwentyYears2022"/>
     <w:p>
       <w:pPr>
         <w:pStyle w:val="Bibliography"/>
@@ -13376,8 +13403,8 @@
         <w:t xml:space="preserve">18(2): e2269.</w:t>
       </w:r>
     </w:p>
-    <w:bookmarkEnd w:id="42"/>
-    <w:bookmarkStart w:id="43" w:name="Xe7ce13ccab992c73a9e9512046271cbf7622a83"/>
+    <w:bookmarkEnd w:id="41"/>
+    <w:bookmarkStart w:id="42" w:name="Xe7ce13ccab992c73a9e9512046271cbf7622a83"/>
     <w:p>
       <w:pPr>
         <w:pStyle w:val="Bibliography"/>
@@ -13453,8 +13480,8 @@
         <w:t xml:space="preserve">18(2): 145–51.</w:t>
       </w:r>
     </w:p>
-    <w:bookmarkEnd w:id="43"/>
-    <w:bookmarkStart w:id="44" w:name="ref-derdowskiNewEcologicalParadigm2020"/>
+    <w:bookmarkEnd w:id="42"/>
+    <w:bookmarkStart w:id="43" w:name="ref-derdowskiNewEcologicalParadigm2020"/>
     <w:p>
       <w:pPr>
         <w:pStyle w:val="Bibliography"/>
@@ -13548,8 +13575,8 @@
         <w:t xml:space="preserve">12(18): 7728.</w:t>
       </w:r>
     </w:p>
-    <w:bookmarkEnd w:id="44"/>
-    <w:bookmarkStart w:id="45" w:name="ref-dietzEnvironmentalValues2005"/>
+    <w:bookmarkEnd w:id="43"/>
+    <w:bookmarkStart w:id="44" w:name="ref-dietzEnvironmentalValues2005"/>
     <w:p>
       <w:pPr>
         <w:pStyle w:val="Bibliography"/>
@@ -13589,8 +13616,8 @@
         <w:t xml:space="preserve">30(1): 335–72.</w:t>
       </w:r>
     </w:p>
-    <w:bookmarkEnd w:id="45"/>
-    <w:bookmarkStart w:id="46" w:name="ref-douglasRiskCultureEssay1982"/>
+    <w:bookmarkEnd w:id="44"/>
+    <w:bookmarkStart w:id="45" w:name="ref-douglasRiskCultureEssay1982"/>
     <w:p>
       <w:pPr>
         <w:pStyle w:val="Bibliography"/>
@@ -13731,8 +13758,8 @@
         <w:t xml:space="preserve">. Berkeley, CA: University of California Press.</w:t>
       </w:r>
     </w:p>
-    <w:bookmarkEnd w:id="46"/>
-    <w:bookmarkStart w:id="47" w:name="ref-dunlapNewEnvironmentalParadigm1978"/>
+    <w:bookmarkEnd w:id="45"/>
+    <w:bookmarkStart w:id="46" w:name="ref-dunlapNewEnvironmentalParadigm1978"/>
     <w:p>
       <w:pPr>
         <w:pStyle w:val="Bibliography"/>
@@ -13778,8 +13805,8 @@
         <w:t xml:space="preserve">9(4): 10–19.</w:t>
       </w:r>
     </w:p>
-    <w:bookmarkEnd w:id="47"/>
-    <w:bookmarkStart w:id="48" w:name="ref-dunlapNewTrendsMeasuring2000"/>
+    <w:bookmarkEnd w:id="46"/>
+    <w:bookmarkStart w:id="47" w:name="ref-dunlapNewTrendsMeasuring2000"/>
     <w:p>
       <w:pPr>
         <w:pStyle w:val="Bibliography"/>
@@ -13861,8 +13888,8 @@
         <w:t xml:space="preserve">56(3): 425–42.</w:t>
       </w:r>
     </w:p>
-    <w:bookmarkEnd w:id="48"/>
-    <w:bookmarkStart w:id="49" w:name="X97bc97cb3733238a68507d703ce2b3ca3096741"/>
+    <w:bookmarkEnd w:id="47"/>
+    <w:bookmarkStart w:id="48" w:name="X97bc97cb3733238a68507d703ce2b3ca3096741"/>
     <w:p>
       <w:pPr>
         <w:pStyle w:val="Bibliography"/>
@@ -13938,8 +13965,8 @@
         <w:t xml:space="preserve">81: 106338.</w:t>
       </w:r>
     </w:p>
-    <w:bookmarkEnd w:id="49"/>
-    <w:bookmarkStart w:id="50" w:name="ref-giffordPersonalSocialFactors2014"/>
+    <w:bookmarkEnd w:id="48"/>
+    <w:bookmarkStart w:id="49" w:name="ref-giffordPersonalSocialFactors2014"/>
     <w:p>
       <w:pPr>
         <w:pStyle w:val="Bibliography"/>
@@ -13997,8 +14024,8 @@
         <w:t xml:space="preserve">: n/a–.</w:t>
       </w:r>
     </w:p>
-    <w:bookmarkEnd w:id="50"/>
-    <w:bookmarkStart w:id="51" w:name="X188fe0a8df7d4dc96743f2a9eacb169ed5f354d"/>
+    <w:bookmarkEnd w:id="49"/>
+    <w:bookmarkStart w:id="50" w:name="X188fe0a8df7d4dc96743f2a9eacb169ed5f354d"/>
     <w:p>
       <w:pPr>
         <w:pStyle w:val="Bibliography"/>
@@ -14116,8 +14143,8 @@
         <w:t xml:space="preserve">143(2): 859–79.</w:t>
       </w:r>
     </w:p>
-    <w:bookmarkEnd w:id="51"/>
-    <w:bookmarkStart w:id="52" w:name="ref-grendstadNewEcologicalParadigm1999"/>
+    <w:bookmarkEnd w:id="50"/>
+    <w:bookmarkStart w:id="51" w:name="ref-grendstadNewEcologicalParadigm1999"/>
     <w:p>
       <w:pPr>
         <w:pStyle w:val="Bibliography"/>
@@ -14178,8 +14205,8 @@
         <w:t xml:space="preserve">8(4): 194–205.</w:t>
       </w:r>
     </w:p>
-    <w:bookmarkEnd w:id="52"/>
-    <w:bookmarkStart w:id="53" w:name="ref-hairPrimerPartialLeast2015"/>
+    <w:bookmarkEnd w:id="51"/>
+    <w:bookmarkStart w:id="52" w:name="ref-hairPrimerPartialLeast2015"/>
     <w:p>
       <w:pPr>
         <w:pStyle w:val="Bibliography"/>
@@ -14271,8 +14298,8 @@
         <w:t xml:space="preserve">. Los Angeles, CA: SAGE Publications.</w:t>
       </w:r>
     </w:p>
-    <w:bookmarkEnd w:id="53"/>
-    <w:bookmarkStart w:id="54" w:name="X93aeb81bb538d46ad13737b2ac6a23087fddd34"/>
+    <w:bookmarkEnd w:id="52"/>
+    <w:bookmarkStart w:id="53" w:name="X93aeb81bb538d46ad13737b2ac6a23087fddd34"/>
     <w:p>
       <w:pPr>
         <w:pStyle w:val="Bibliography"/>
@@ -14312,8 +14339,8 @@
         <w:t xml:space="preserve">25(3): 238–58.</w:t>
       </w:r>
     </w:p>
-    <w:bookmarkEnd w:id="54"/>
-    <w:bookmarkStart w:id="55" w:name="ref-huCutoffCriteriaFit1999"/>
+    <w:bookmarkEnd w:id="53"/>
+    <w:bookmarkStart w:id="54" w:name="ref-huCutoffCriteriaFit1999"/>
     <w:p>
       <w:pPr>
         <w:pStyle w:val="Bibliography"/>
@@ -14386,8 +14413,8 @@
         <w:t xml:space="preserve">6(1): 1–55.</w:t>
       </w:r>
     </w:p>
-    <w:bookmarkEnd w:id="55"/>
-    <w:bookmarkStart w:id="56" w:name="Xed27ba9cab4878368b76122bd8add1eb914ea06"/>
+    <w:bookmarkEnd w:id="54"/>
+    <w:bookmarkStart w:id="55" w:name="Xed27ba9cab4878368b76122bd8add1eb914ea06"/>
     <w:p>
       <w:pPr>
         <w:pStyle w:val="Bibliography"/>
@@ -14502,8 +14529,8 @@
         <w:t xml:space="preserve">42(4): 484–508.</w:t>
       </w:r>
     </w:p>
-    <w:bookmarkEnd w:id="56"/>
-    <w:bookmarkStart w:id="57" w:name="ref-jenkins-smithIdeologyCultureRisk1994"/>
+    <w:bookmarkEnd w:id="55"/>
+    <w:bookmarkStart w:id="56" w:name="ref-jenkins-smithIdeologyCultureRisk1994"/>
     <w:p>
       <w:pPr>
         <w:pStyle w:val="Bibliography"/>
@@ -14599,8 +14626,8 @@
         <w:t xml:space="preserve">, eds. Dennis J. Coyle and Richard J. Ellis. Boulder, CO: Westview Press, 17–32.</w:t>
       </w:r>
     </w:p>
-    <w:bookmarkEnd w:id="57"/>
-    <w:bookmarkStart w:id="58" w:name="ref-jonesLeadingWayCompromise2011"/>
+    <w:bookmarkEnd w:id="56"/>
+    <w:bookmarkStart w:id="57" w:name="ref-jonesLeadingWayCompromise2011"/>
     <w:p>
       <w:pPr>
         <w:pStyle w:val="Bibliography"/>
@@ -14673,8 +14700,8 @@
         <w:t xml:space="preserve">44(04): 720–25.</w:t>
       </w:r>
     </w:p>
-    <w:bookmarkEnd w:id="58"/>
-    <w:bookmarkStart w:id="59" w:name="ref-kahanCulturalCognitionConception2012"/>
+    <w:bookmarkEnd w:id="57"/>
+    <w:bookmarkStart w:id="58" w:name="ref-kahanCulturalCognitionConception2012"/>
     <w:p>
       <w:pPr>
         <w:pStyle w:val="Bibliography"/>
@@ -14879,8 +14906,8 @@
         <w:t xml:space="preserve">, eds. Sabine Roeser, Rafaela Hillerbrand, Per Sandin, and Martin Peterson. Springer, 725–59.</w:t>
       </w:r>
     </w:p>
-    <w:bookmarkEnd w:id="59"/>
-    <w:bookmarkStart w:id="60" w:name="ref-kahanCulturalCognitionPublic2006"/>
+    <w:bookmarkEnd w:id="58"/>
+    <w:bookmarkStart w:id="59" w:name="ref-kahanCulturalCognitionPublic2006"/>
     <w:p>
       <w:pPr>
         <w:pStyle w:val="Bibliography"/>
@@ -14932,8 +14959,8 @@
         <w:t xml:space="preserve">24(1): 147–70.</w:t>
       </w:r>
     </w:p>
-    <w:bookmarkEnd w:id="60"/>
-    <w:bookmarkStart w:id="61" w:name="X173998bc5d911bb28728c94f77cc6d079d9e73b"/>
+    <w:bookmarkEnd w:id="59"/>
+    <w:bookmarkStart w:id="60" w:name="X173998bc5d911bb28728c94f77cc6d079d9e73b"/>
     <w:p>
       <w:pPr>
         <w:pStyle w:val="Bibliography"/>
@@ -15006,8 +15033,8 @@
         <w:t xml:space="preserve">4(3): 465–505.</w:t>
       </w:r>
     </w:p>
-    <w:bookmarkEnd w:id="61"/>
-    <w:bookmarkStart w:id="62" w:name="ref-kahanGeoengineeringClimateChange2015"/>
+    <w:bookmarkEnd w:id="60"/>
+    <w:bookmarkStart w:id="61" w:name="ref-kahanGeoengineeringClimateChange2015"/>
     <w:p>
       <w:pPr>
         <w:pStyle w:val="Bibliography"/>
@@ -15071,8 +15098,8 @@
         <w:t xml:space="preserve">658(1): 192–222.</w:t>
       </w:r>
     </w:p>
-    <w:bookmarkEnd w:id="62"/>
-    <w:bookmarkStart w:id="63" w:name="ref-kahanPolarizingImpactScience2012"/>
+    <w:bookmarkEnd w:id="61"/>
+    <w:bookmarkStart w:id="62" w:name="ref-kahanPolarizingImpactScience2012"/>
     <w:p>
       <w:pPr>
         <w:pStyle w:val="Bibliography"/>
@@ -15148,8 +15175,8 @@
         <w:t xml:space="preserve">2(10): 732–35.</w:t>
       </w:r>
     </w:p>
-    <w:bookmarkEnd w:id="63"/>
-    <w:bookmarkStart w:id="64" w:name="ref-kaiserOffsettingBehavioralCosts2021"/>
+    <w:bookmarkEnd w:id="62"/>
+    <w:bookmarkStart w:id="63" w:name="ref-kaiserOffsettingBehavioralCosts2021"/>
     <w:p>
       <w:pPr>
         <w:pStyle w:val="Bibliography"/>
@@ -15222,8 +15249,8 @@
         <w:t xml:space="preserve">183: 111158.</w:t>
       </w:r>
     </w:p>
-    <w:bookmarkEnd w:id="64"/>
-    <w:bookmarkStart w:id="65" w:name="ref-kollmussMindGapWhy2002"/>
+    <w:bookmarkEnd w:id="63"/>
+    <w:bookmarkStart w:id="64" w:name="ref-kollmussMindGapWhy2002"/>
     <w:p>
       <w:pPr>
         <w:pStyle w:val="Bibliography"/>
@@ -15308,8 +15335,8 @@
         <w:t xml:space="preserve">8(3): 239–60.</w:t>
       </w:r>
     </w:p>
-    <w:bookmarkEnd w:id="65"/>
-    <w:bookmarkStart w:id="66" w:name="ref-kovacsActingWeFeel2024"/>
+    <w:bookmarkEnd w:id="64"/>
+    <w:bookmarkStart w:id="65" w:name="ref-kovacsActingWeFeel2024"/>
     <w:p>
       <w:pPr>
         <w:pStyle w:val="Bibliography"/>
@@ -15370,8 +15397,8 @@
         <w:t xml:space="preserve">96: 102327.</w:t>
       </w:r>
     </w:p>
-    <w:bookmarkEnd w:id="66"/>
-    <w:bookmarkStart w:id="67" w:name="Xf1a4dffe6040874cfb0161fcd81daa309d7015e"/>
+    <w:bookmarkEnd w:id="65"/>
+    <w:bookmarkStart w:id="66" w:name="Xf1a4dffe6040874cfb0161fcd81daa309d7015e"/>
     <w:p>
       <w:pPr>
         <w:pStyle w:val="Bibliography"/>
@@ -15468,8 +15495,8 @@
         <w:t xml:space="preserve">11(12): 3324.</w:t>
       </w:r>
     </w:p>
-    <w:bookmarkEnd w:id="67"/>
-    <w:bookmarkStart w:id="68" w:name="ref-louMetaanalysisTemporalShifts2022"/>
+    <w:bookmarkEnd w:id="66"/>
+    <w:bookmarkStart w:id="67" w:name="ref-louMetaanalysisTemporalShifts2022"/>
     <w:p>
       <w:pPr>
         <w:pStyle w:val="Bibliography"/>
@@ -15557,8 +15584,8 @@
         <w:t xml:space="preserve">38: 100335.</w:t>
       </w:r>
     </w:p>
-    <w:bookmarkEnd w:id="68"/>
-    <w:bookmarkStart w:id="69" w:name="ref-mackayPeopleWhoFeel2019"/>
+    <w:bookmarkEnd w:id="67"/>
+    <w:bookmarkStart w:id="68" w:name="ref-mackayPeopleWhoFeel2019"/>
     <w:p>
       <w:pPr>
         <w:pStyle w:val="Bibliography"/>
@@ -15631,8 +15658,8 @@
         <w:t xml:space="preserve">65: 101323.</w:t>
       </w:r>
     </w:p>
-    <w:bookmarkEnd w:id="69"/>
-    <w:bookmarkStart w:id="70" w:name="Xf2ff0bf56d7cb819fa6efd2aa505620565eb0aa"/>
+    <w:bookmarkEnd w:id="68"/>
+    <w:bookmarkStart w:id="69" w:name="Xf2ff0bf56d7cb819fa6efd2aa505620565eb0aa"/>
     <w:p>
       <w:pPr>
         <w:pStyle w:val="Bibliography"/>
@@ -15717,8 +15744,8 @@
         <w:t xml:space="preserve">11(2): 532.</w:t>
       </w:r>
     </w:p>
-    <w:bookmarkEnd w:id="70"/>
-    <w:bookmarkStart w:id="71" w:name="ref-mayerConnectednessNatureScale2004"/>
+    <w:bookmarkEnd w:id="69"/>
+    <w:bookmarkStart w:id="70" w:name="ref-mayerConnectednessNatureScale2004"/>
     <w:p>
       <w:pPr>
         <w:pStyle w:val="Bibliography"/>
@@ -15824,8 +15851,8 @@
         <w:t xml:space="preserve">24(4): 503–15.</w:t>
       </w:r>
     </w:p>
-    <w:bookmarkEnd w:id="71"/>
-    <w:bookmarkStart w:id="72" w:name="Xc43ec768c008176b9f89abb4f6bf691741c435f"/>
+    <w:bookmarkEnd w:id="70"/>
+    <w:bookmarkStart w:id="71" w:name="Xc43ec768c008176b9f89abb4f6bf691741c435f"/>
     <w:p>
       <w:pPr>
         <w:pStyle w:val="Bibliography"/>
@@ -15919,8 +15946,8 @@
         <w:t xml:space="preserve">22(4): 416–31.</w:t>
       </w:r>
     </w:p>
-    <w:bookmarkEnd w:id="72"/>
-    <w:bookmarkStart w:id="73" w:name="ref-nisbetNatureRelatednessScale2009"/>
+    <w:bookmarkEnd w:id="71"/>
+    <w:bookmarkStart w:id="72" w:name="ref-nisbetNatureRelatednessScale2009"/>
     <w:p>
       <w:pPr>
         <w:pStyle w:val="Bibliography"/>
@@ -16002,8 +16029,8 @@
         <w:t xml:space="preserve">41(5): 715–40.</w:t>
       </w:r>
     </w:p>
-    <w:bookmarkEnd w:id="73"/>
-    <w:bookmarkStart w:id="74" w:name="X3b158972cbdaa45d56667a7f2c1f74a2ffefad4"/>
+    <w:bookmarkEnd w:id="72"/>
+    <w:bookmarkStart w:id="73" w:name="X3b158972cbdaa45d56667a7f2c1f74a2ffefad4"/>
     <w:p>
       <w:pPr>
         <w:pStyle w:val="Bibliography"/>
@@ -16081,8 +16108,8 @@
         <w:t xml:space="preserve">, ed. Christopher M. Weible. New York, NY: Routledge, 130–60.</w:t>
       </w:r>
     </w:p>
-    <w:bookmarkEnd w:id="74"/>
-    <w:bookmarkStart w:id="75" w:name="Xb4c99a0be57d39ff98fa8a07a8fe8d8503fbbac"/>
+    <w:bookmarkEnd w:id="73"/>
+    <w:bookmarkStart w:id="74" w:name="Xb4c99a0be57d39ff98fa8a07a8fe8d8503fbbac"/>
     <w:p>
       <w:pPr>
         <w:pStyle w:val="Bibliography"/>
@@ -16174,8 +16201,8 @@
         <w:t xml:space="preserve">. New York, NY: Routledge.</w:t>
       </w:r>
     </w:p>
-    <w:bookmarkEnd w:id="75"/>
-    <w:bookmarkStart w:id="76" w:name="ref-nowlinWhoShouldMore2022"/>
+    <w:bookmarkEnd w:id="74"/>
+    <w:bookmarkStart w:id="75" w:name="ref-nowlinWhoShouldMore2022"/>
     <w:p>
       <w:pPr>
         <w:pStyle w:val="Bibliography"/>
@@ -16284,8 +16311,8 @@
         <w:t xml:space="preserve">39(4): 468–85.</w:t>
       </w:r>
     </w:p>
-    <w:bookmarkEnd w:id="76"/>
-    <w:bookmarkStart w:id="77" w:name="ref-nowlinCulturalTheoryPartisanship2020"/>
+    <w:bookmarkEnd w:id="75"/>
+    <w:bookmarkStart w:id="76" w:name="ref-nowlinCulturalTheoryPartisanship2020"/>
     <w:p>
       <w:pPr>
         <w:pStyle w:val="Bibliography"/>
@@ -16349,8 +16376,8 @@
         <w:t xml:space="preserve">101(2): 878–92.</w:t>
       </w:r>
     </w:p>
-    <w:bookmarkEnd w:id="77"/>
-    <w:bookmarkStart w:id="78" w:name="ref-overdevestUsingCulturalCognition2013"/>
+    <w:bookmarkEnd w:id="76"/>
+    <w:bookmarkStart w:id="77" w:name="ref-overdevestUsingCulturalCognition2013"/>
     <w:p>
       <w:pPr>
         <w:pStyle w:val="Bibliography"/>
@@ -16420,8 +16447,8 @@
         <w:t xml:space="preserve">26(9): 987–1007.</w:t>
       </w:r>
     </w:p>
-    <w:bookmarkEnd w:id="78"/>
-    <w:bookmarkStart w:id="79" w:name="X7b9c245bd397efc5510afdedb24da66fcfecf34"/>
+    <w:bookmarkEnd w:id="77"/>
+    <w:bookmarkStart w:id="78" w:name="X7b9c245bd397efc5510afdedb24da66fcfecf34"/>
     <w:p>
       <w:pPr>
         <w:pStyle w:val="Bibliography"/>
@@ -16500,8 +16527,8 @@
         <w:t xml:space="preserve">17(10): 4613.</w:t>
       </w:r>
     </w:p>
-    <w:bookmarkEnd w:id="79"/>
-    <w:bookmarkStart w:id="80" w:name="ref-riepeValuesBeliefsNorms2021"/>
+    <w:bookmarkEnd w:id="78"/>
+    <w:bookmarkStart w:id="79" w:name="ref-riepeValuesBeliefsNorms2021"/>
     <w:p>
       <w:pPr>
         <w:pStyle w:val="Bibliography"/>
@@ -16604,8 +16631,8 @@
         <w:t xml:space="preserve">34(6): 703–24.</w:t>
       </w:r>
     </w:p>
-    <w:bookmarkEnd w:id="80"/>
-    <w:bookmarkStart w:id="81" w:name="X5ac8eb1d1356972d917d5777697e9a83fe58bbc"/>
+    <w:bookmarkEnd w:id="79"/>
+    <w:bookmarkStart w:id="80" w:name="X5ac8eb1d1356972d917d5777697e9a83fe58bbc"/>
     <w:p>
       <w:pPr>
         <w:pStyle w:val="Bibliography"/>
@@ -16681,8 +16708,8 @@
         <w:t xml:space="preserve">42(4): 509–27.</w:t>
       </w:r>
     </w:p>
-    <w:bookmarkEnd w:id="81"/>
-    <w:bookmarkStart w:id="82" w:name="ref-rosseelLavaanPackageStructural2012"/>
+    <w:bookmarkEnd w:id="80"/>
+    <w:bookmarkStart w:id="81" w:name="ref-rosseelLavaanPackageStructural2012"/>
     <w:p>
       <w:pPr>
         <w:pStyle w:val="Bibliography"/>
@@ -16734,8 +16761,8 @@
         <w:t xml:space="preserve">48(2): 1–36.</w:t>
       </w:r>
     </w:p>
-    <w:bookmarkEnd w:id="82"/>
-    <w:bookmarkStart w:id="83" w:name="ref-sabatierPolicyChangeLearning1993"/>
+    <w:bookmarkEnd w:id="81"/>
+    <w:bookmarkStart w:id="82" w:name="ref-sabatierPolicyChangeLearning1993"/>
     <w:p>
       <w:pPr>
         <w:pStyle w:val="Bibliography"/>
@@ -16820,8 +16847,8 @@
         <w:t xml:space="preserve">. Boulder, CO: Westview Press.</w:t>
       </w:r>
     </w:p>
-    <w:bookmarkEnd w:id="83"/>
-    <w:bookmarkStart w:id="84" w:name="ref-slimakPersonalValuesBeliefs2006"/>
+    <w:bookmarkEnd w:id="82"/>
+    <w:bookmarkStart w:id="83" w:name="ref-slimakPersonalValuesBeliefs2006"/>
     <w:p>
       <w:pPr>
         <w:pStyle w:val="Bibliography"/>
@@ -16879,8 +16906,8 @@
         <w:t xml:space="preserve">26(6): 1689–1705.</w:t>
       </w:r>
     </w:p>
-    <w:bookmarkEnd w:id="84"/>
-    <w:bookmarkStart w:id="85" w:name="ref-sotirovCognitiveTheoryShifting2016"/>
+    <w:bookmarkEnd w:id="83"/>
+    <w:bookmarkStart w:id="84" w:name="ref-sotirovCognitiveTheoryShifting2016"/>
     <w:p>
       <w:pPr>
         <w:pStyle w:val="Bibliography"/>
@@ -16977,8 +17004,8 @@
         <w:t xml:space="preserve">49(2): 125–54.</w:t>
       </w:r>
     </w:p>
-    <w:bookmarkEnd w:id="85"/>
-    <w:bookmarkStart w:id="86" w:name="Xcd4128f84630b625b9be8a5d160749108b13e9f"/>
+    <w:bookmarkEnd w:id="84"/>
+    <w:bookmarkStart w:id="85" w:name="Xcd4128f84630b625b9be8a5d160749108b13e9f"/>
     <w:p>
       <w:pPr>
         <w:pStyle w:val="Bibliography"/>
@@ -17039,8 +17066,8 @@
         <w:t xml:space="preserve">81: 101780.</w:t>
       </w:r>
     </w:p>
-    <w:bookmarkEnd w:id="86"/>
-    <w:bookmarkStart w:id="87" w:name="Xd80995be13b72525320e599330d3ba78efa80ab"/>
+    <w:bookmarkEnd w:id="85"/>
+    <w:bookmarkStart w:id="86" w:name="Xd80995be13b72525320e599330d3ba78efa80ab"/>
     <w:p>
       <w:pPr>
         <w:pStyle w:val="Bibliography"/>
@@ -17092,8 +17119,8 @@
         <w:t xml:space="preserve">34(3): 291–310.</w:t>
       </w:r>
     </w:p>
-    <w:bookmarkEnd w:id="87"/>
-    <w:bookmarkStart w:id="88" w:name="ref-stegGeneralAntecedentsPersonal2011"/>
+    <w:bookmarkEnd w:id="86"/>
+    <w:bookmarkStart w:id="87" w:name="ref-stegGeneralAntecedentsPersonal2011"/>
     <w:p>
       <w:pPr>
         <w:pStyle w:val="Bibliography"/>
@@ -17202,8 +17229,8 @@
         <w:t xml:space="preserve">24(4): 349–67.</w:t>
       </w:r>
     </w:p>
-    <w:bookmarkEnd w:id="88"/>
-    <w:bookmarkStart w:id="89" w:name="ref-sternNewEnvironmentalTheories2000"/>
+    <w:bookmarkEnd w:id="87"/>
+    <w:bookmarkStart w:id="88" w:name="ref-sternNewEnvironmentalTheories2000"/>
     <w:p>
       <w:pPr>
         <w:pStyle w:val="Bibliography"/>
@@ -17276,8 +17303,8 @@
         <w:t xml:space="preserve">56(3): 407–24.</w:t>
       </w:r>
     </w:p>
-    <w:bookmarkEnd w:id="89"/>
-    <w:bookmarkStart w:id="90" w:name="ref-sternValueBasisEnvironmental1994"/>
+    <w:bookmarkEnd w:id="88"/>
+    <w:bookmarkStart w:id="89" w:name="ref-sternValueBasisEnvironmental1994"/>
     <w:p>
       <w:pPr>
         <w:pStyle w:val="Bibliography"/>
@@ -17329,8 +17356,8 @@
         <w:t xml:space="preserve">50(3): 65–84.</w:t>
       </w:r>
     </w:p>
-    <w:bookmarkEnd w:id="90"/>
-    <w:bookmarkStart w:id="91" w:name="X253113b103196daf1c65587a792fbb2f472ac2b"/>
+    <w:bookmarkEnd w:id="89"/>
+    <w:bookmarkStart w:id="90" w:name="X253113b103196daf1c65587a792fbb2f472ac2b"/>
     <w:p>
       <w:pPr>
         <w:pStyle w:val="Bibliography"/>
@@ -17415,8 +17442,8 @@
         <w:t xml:space="preserve">6(2): 81–97.</w:t>
       </w:r>
     </w:p>
-    <w:bookmarkEnd w:id="91"/>
-    <w:bookmarkStart w:id="92" w:name="ref-sternNewEcologicalParadigm1995"/>
+    <w:bookmarkEnd w:id="90"/>
+    <w:bookmarkStart w:id="91" w:name="ref-sternNewEcologicalParadigm1995"/>
     <w:p>
       <w:pPr>
         <w:pStyle w:val="Bibliography"/>
@@ -17468,8 +17495,8 @@
         <w:t xml:space="preserve">27(6): 723–43.</w:t>
       </w:r>
     </w:p>
-    <w:bookmarkEnd w:id="92"/>
-    <w:bookmarkStart w:id="93" w:name="ref-thompsonCulturalTheory1990"/>
+    <w:bookmarkEnd w:id="91"/>
+    <w:bookmarkStart w:id="92" w:name="ref-thompsonCulturalTheory1990"/>
     <w:p>
       <w:pPr>
         <w:pStyle w:val="Bibliography"/>
@@ -17505,8 +17532,8 @@
         <w:t xml:space="preserve">. Boulder, CO: Westview Press.</w:t>
       </w:r>
     </w:p>
-    <w:bookmarkEnd w:id="93"/>
-    <w:bookmarkStart w:id="94" w:name="ref-tumlisonWhatExplainsLocal2018"/>
+    <w:bookmarkEnd w:id="92"/>
+    <w:bookmarkStart w:id="93" w:name="ref-tumlisonWhatExplainsLocal2018"/>
     <w:p>
       <w:pPr>
         <w:pStyle w:val="Bibliography"/>
@@ -17561,8 +17588,8 @@
         <w:t xml:space="preserve">117: 377–86.</w:t>
       </w:r>
     </w:p>
-    <w:bookmarkEnd w:id="94"/>
-    <w:bookmarkStart w:id="95" w:name="Xefa73ea30a5a72e540bdb57cb82e0acc6c0b668"/>
+    <w:bookmarkEnd w:id="93"/>
+    <w:bookmarkStart w:id="94" w:name="Xefa73ea30a5a72e540bdb57cb82e0acc6c0b668"/>
     <w:p>
       <w:pPr>
         <w:pStyle w:val="Bibliography"/>
@@ -17647,8 +17674,8 @@
         <w:t xml:space="preserve">112: 103071.</w:t>
       </w:r>
     </w:p>
-    <w:bookmarkEnd w:id="95"/>
-    <w:bookmarkStart w:id="96" w:name="X38dc9bae8a351d94f350e2cf56901a7f577d5c8"/>
+    <w:bookmarkEnd w:id="94"/>
+    <w:bookmarkStart w:id="95" w:name="X38dc9bae8a351d94f350e2cf56901a7f577d5c8"/>
     <w:p>
       <w:pPr>
         <w:pStyle w:val="Bibliography"/>
@@ -17721,8 +17748,8 @@
         <w:t xml:space="preserve">34(1): 180–93.</w:t>
       </w:r>
     </w:p>
-    <w:bookmarkEnd w:id="96"/>
-    <w:bookmarkStart w:id="97" w:name="ref-xiaoEcologicalWorldviewCentral2019"/>
+    <w:bookmarkEnd w:id="95"/>
+    <w:bookmarkStart w:id="96" w:name="ref-xiaoEcologicalWorldviewCentral2019"/>
     <w:p>
       <w:pPr>
         <w:pStyle w:val="Bibliography"/>
@@ -17819,8 +17846,8 @@
         <w:t xml:space="preserve">32(1): 53–72.</w:t>
       </w:r>
     </w:p>
-    <w:bookmarkEnd w:id="97"/>
-    <w:bookmarkStart w:id="98" w:name="Xb710d7d8977db263a9186d05b028690def8f336"/>
+    <w:bookmarkEnd w:id="96"/>
+    <w:bookmarkStart w:id="97" w:name="Xb710d7d8977db263a9186d05b028690def8f336"/>
     <w:p>
       <w:pPr>
         <w:pStyle w:val="Bibliography"/>
@@ -17881,8 +17908,8 @@
         <w:t xml:space="preserve">40.</w:t>
       </w:r>
     </w:p>
-    <w:bookmarkEnd w:id="98"/>
-    <w:bookmarkStart w:id="99" w:name="X3875dcb7f594a5547f80964e1bc725448b0b63f"/>
+    <w:bookmarkEnd w:id="97"/>
+    <w:bookmarkStart w:id="98" w:name="X3875dcb7f594a5547f80964e1bc725448b0b63f"/>
     <w:p>
       <w:pPr>
         <w:pStyle w:val="Bibliography"/>
@@ -17946,8 +17973,8 @@
         <w:t xml:space="preserve">22.</w:t>
       </w:r>
     </w:p>
-    <w:bookmarkEnd w:id="99"/>
-    <w:bookmarkStart w:id="100" w:name="ref-zhuBibliometricVisualAnalysis2021"/>
+    <w:bookmarkEnd w:id="98"/>
+    <w:bookmarkStart w:id="99" w:name="ref-zhuBibliometricVisualAnalysis2021"/>
     <w:p>
       <w:pPr>
         <w:pStyle w:val="Bibliography"/>
@@ -18011,9 +18038,9 @@
         <w:t xml:space="preserve">13(18): 10338.</w:t>
       </w:r>
     </w:p>
+    <w:bookmarkEnd w:id="99"/>
     <w:bookmarkEnd w:id="100"/>
     <w:bookmarkEnd w:id="101"/>
-    <w:bookmarkEnd w:id="102"/>
     <w:sectPr>
       <w:footnotePr>
         <w:numRestart w:val="eachSect"/>
@@ -18077,7 +18104,7 @@
         <w:t xml:space="preserve"> </w:t>
       </w:r>
       <w:r>
-        <w:t xml:space="preserve">Affiliation pending</w:t>
+        <w:t xml:space="preserve">Adjunct Instructor, School of Government, University of North Carolina – Chapel Hill</w:t>
       </w:r>
     </w:p>
   </w:footnote>
@@ -18152,30 +18179,11 @@
         <w:t xml:space="preserve"> </w:t>
       </w:r>
       <w:r>
-        <w:t xml:space="preserve">IRB approval for the survey was approved by … Human Subjects Committee on April 3, 2017, protocol number 37-17-0256.</w:t>
+        <w:t xml:space="preserve">The results of analyses that separates public and private are substantively the same as presented here.</w:t>
       </w:r>
     </w:p>
   </w:footnote>
-  <w:footnote w:id="24">
-    <w:p>
-      <w:pPr>
-        <w:pStyle w:val="FootnoteText"/>
-      </w:pPr>
-      <w:r>
-        <w:rPr>
-          <w:rStyle w:val="FootnoteReference"/>
-        </w:rPr>
-        <w:footnoteRef/>
-      </w:r>
-      <w:r>
-        <w:t xml:space="preserve"> </w:t>
-      </w:r>
-      <w:r>
-        <w:t xml:space="preserve">However, the supplemental materials includes analyses that separate public and private, and the results are substantively the same as presented here.</w:t>
-      </w:r>
-    </w:p>
-  </w:footnote>
-  <w:footnote w:id="27">
+  <w:footnote w:id="26">
     <w:p>
       <w:pPr>
         <w:pStyle w:val="FootnoteText"/>
@@ -18215,7 +18223,7 @@
         <w:t xml:space="preserve">(e.g., Kahan et al. 2007)</w:t>
       </w:r>
       <w:r>
-        <w:t xml:space="preserve">. More information about the demographic variables is available in the supplemental materials.</w:t>
+        <w:t xml:space="preserve">.</w:t>
       </w:r>
     </w:p>
   </w:footnote>

</xml_diff>